<commit_message>
feat: manage sales and replay links per edition
</commit_message>
<xml_diff>
--- a/platform/docs/client-handoff/HANDOFF-CLIENT-CHALLENGE-AMAZON-FBA.docx
+++ b/platform/docs/client-handoff/HANDOFF-CLIENT-CHALLENGE-AMAZON-FBA.docx
@@ -147,7 +147,7 @@
           </w:tcPr>
           <w:p>
             <w:r>
-              <w:t>2026-05-22 15:46</w:t>
+              <w:t>2026-05-22 16:09</w:t>
             </w:r>
           </w:p>
         </w:tc>
@@ -505,7 +505,7 @@
         <w:ind w:left="288" w:hanging="216"/>
       </w:pPr>
       <w:r>
-        <w:t>• URL: `&lt;ADMIN_CONSOLE_URL&gt;`</w:t>
+        <w:t>• URL: `http://whatsapp.178.104.229.163.nip.io:3001/`</w:t>
       </w:r>
     </w:p>
     <w:p>
@@ -521,7 +521,7 @@
         <w:ind w:left="288" w:hanging="216"/>
       </w:pPr>
       <w:r>
-        <w:t>• URL (tokenized): `&lt;OPS_STREAMYARD_PORTAL_URL&gt;`</w:t>
+        <w:t>• URL (tokenized): `http://whatsapp.178.104.229.163.nip.io:3001/ops/streamyard?token=ops_streamyard_2026_fba_client_x9K4mP2qL7zR`</w:t>
       </w:r>
     </w:p>
     <w:p>
@@ -569,7 +569,7 @@
         <w:ind w:left="288" w:hanging="216"/>
       </w:pPr>
       <w:r>
-        <w:t>• Payment page URL (Day 3 offer): `&lt;PAYMENT_URL&gt;`</w:t>
+        <w:t>• Payment page URL (Day 3 offer): `A RENSEIGNER`</w:t>
       </w:r>
     </w:p>
     <w:p>
@@ -577,7 +577,7 @@
         <w:ind w:left="288" w:hanging="216"/>
       </w:pPr>
       <w:r>
-        <w:t>• Booking link (closer call): `&lt;CLOSER_BOOKING_URL&gt;`</w:t>
+        <w:t>• Booking link (closer call): `A RENSEIGNER`</w:t>
       </w:r>
     </w:p>
     <w:p>
@@ -585,7 +585,7 @@
         <w:ind w:left="288" w:hanging="216"/>
       </w:pPr>
       <w:r>
-        <w:t>• Replay Day 1 URL: `&lt;REPLAY_DAY1_URL&gt;`</w:t>
+        <w:t>• Replay Day 1 URL: `A RENSEIGNER`</w:t>
       </w:r>
     </w:p>
     <w:p>
@@ -593,7 +593,7 @@
         <w:ind w:left="288" w:hanging="216"/>
       </w:pPr>
       <w:r>
-        <w:t>• Replay Day 2 URL: `&lt;REPLAY_DAY2_URL&gt;`</w:t>
+        <w:t>• Replay Day 2 URL: `A RENSEIGNER`</w:t>
       </w:r>
     </w:p>
     <w:p>
@@ -601,7 +601,73 @@
         <w:ind w:left="288" w:hanging="216"/>
       </w:pPr>
       <w:r>
-        <w:t>• Replay Day 3 URL: `&lt;REPLAY_DAY3_URL&gt;`</w:t>
+        <w:t>• Replay Day 3 URL: `A RENSEIGNER`</w:t>
+      </w:r>
+    </w:p>
+    <w:p>
+      <w:r>
+        <w:t>Where these URLs are used:</w:t>
+      </w:r>
+    </w:p>
+    <w:p>
+      <w:pPr>
+        <w:ind w:left="288" w:hanging="216"/>
+      </w:pPr>
+      <w:r>
+        <w:t>• Payment URL is injected into the Day 3 offer template (`live_day3_offer_hplus2`) as `{{2}}`.</w:t>
+      </w:r>
+    </w:p>
+    <w:p>
+      <w:pPr>
+        <w:ind w:left="288" w:hanging="216"/>
+      </w:pPr>
+      <w:r>
+        <w:t>• Booking URL is injected into `post_closer_call` and `post_recap_attended` as `{{2}}`.</w:t>
+      </w:r>
+    </w:p>
+    <w:p>
+      <w:pPr>
+        <w:ind w:left="288" w:hanging="216"/>
+      </w:pPr>
+      <w:r>
+        <w:t>• Replay URLs are injected into:</w:t>
+      </w:r>
+    </w:p>
+    <w:p>
+      <w:pPr>
+        <w:ind w:left="288" w:hanging="216"/>
+      </w:pPr>
+      <w:r>
+        <w:t>• `post_recap_registered_absent` (`{{2}}`, `{{3}}`, `{{4}}`)</w:t>
+      </w:r>
+    </w:p>
+    <w:p>
+      <w:pPr>
+        <w:ind w:left="288" w:hanging="216"/>
+      </w:pPr>
+      <w:r>
+        <w:t>• `post_recap_not_registered` (`{{2}}`, `{{3}}`, `{{4}}`)</w:t>
+      </w:r>
+    </w:p>
+    <w:p>
+      <w:r>
+        <w:t>Notes:</w:t>
+      </w:r>
+    </w:p>
+    <w:p>
+      <w:pPr>
+        <w:ind w:left="288" w:hanging="216"/>
+      </w:pPr>
+      <w:r>
+        <w:t>• These links are configured directly in the `PILOTAGE LIVE` portal, for the relevant edition.</w:t>
+      </w:r>
+    </w:p>
+    <w:p>
+      <w:pPr>
+        <w:ind w:left="288" w:hanging="216"/>
+      </w:pPr>
+      <w:r>
+        <w:t>• You can go live without replays configured (post-live recap will not contain links yet), but payment + closer booking should be configured before Day 3.</w:t>
       </w:r>
     </w:p>
     <w:p>
@@ -950,6 +1016,100 @@
     </w:p>
     <w:p>
       <w:r>
+        <w:t>#### 4.A bis Configure edition links (mandatory before offer/replay messages)</w:t>
+      </w:r>
+    </w:p>
+    <w:p>
+      <w:r>
+        <w:t>1. Stay on the same `PILOTAGE LIVE` portal.</w:t>
+      </w:r>
+    </w:p>
+    <w:p>
+      <w:r>
+        <w:t>2. Keep the correct cohort + `edition_key`.</w:t>
+      </w:r>
+    </w:p>
+    <w:p>
+      <w:r>
+        <w:t>3. Fill:</w:t>
+      </w:r>
+    </w:p>
+    <w:p>
+      <w:pPr>
+        <w:ind w:left="288" w:hanging="216"/>
+      </w:pPr>
+      <w:r>
+        <w:t>• payment link</w:t>
+      </w:r>
+    </w:p>
+    <w:p>
+      <w:pPr>
+        <w:ind w:left="288" w:hanging="216"/>
+      </w:pPr>
+      <w:r>
+        <w:t>• closer / booking link</w:t>
+      </w:r>
+    </w:p>
+    <w:p>
+      <w:pPr>
+        <w:ind w:left="288" w:hanging="216"/>
+      </w:pPr>
+      <w:r>
+        <w:t>• replay day 1</w:t>
+      </w:r>
+    </w:p>
+    <w:p>
+      <w:pPr>
+        <w:ind w:left="288" w:hanging="216"/>
+      </w:pPr>
+      <w:r>
+        <w:t>• replay day 2</w:t>
+      </w:r>
+    </w:p>
+    <w:p>
+      <w:pPr>
+        <w:ind w:left="288" w:hanging="216"/>
+      </w:pPr>
+      <w:r>
+        <w:t>• replay day 3</w:t>
+      </w:r>
+    </w:p>
+    <w:p>
+      <w:r>
+        <w:t>4. Click "Enregistrer les liens".</w:t>
+      </w:r>
+    </w:p>
+    <w:p>
+      <w:r>
+        <w:t>Outcome:</w:t>
+      </w:r>
+    </w:p>
+    <w:p>
+      <w:pPr>
+        <w:ind w:left="288" w:hanging="216"/>
+      </w:pPr>
+      <w:r>
+        <w:t>• Day 3 offer messages use the correct payment page.</w:t>
+      </w:r>
+    </w:p>
+    <w:p>
+      <w:pPr>
+        <w:ind w:left="288" w:hanging="216"/>
+      </w:pPr>
+      <w:r>
+        <w:t>• Post-live recap messages use the correct replay links.</w:t>
+      </w:r>
+    </w:p>
+    <w:p>
+      <w:pPr>
+        <w:ind w:left="288" w:hanging="216"/>
+      </w:pPr>
+      <w:r>
+        <w:t>• Booking / closer messages use the correct reservation link.</w:t>
+      </w:r>
+    </w:p>
+    <w:p>
+      <w:r>
         <w:t>#### 4.B Just before / at the start (recommended)</w:t>
       </w:r>
     </w:p>
@@ -1130,6 +1290,34 @@
         <w:pStyle w:val="Heading3"/>
       </w:pPr>
       <w:r>
+        <w:t>Wrong payment / closer / replay link</w:t>
+      </w:r>
+    </w:p>
+    <w:p>
+      <w:r>
+        <w:t>1. Open PILOTAGE LIVE.</w:t>
+      </w:r>
+    </w:p>
+    <w:p>
+      <w:r>
+        <w:t>2. Keep the correct `edition_key`.</w:t>
+      </w:r>
+    </w:p>
+    <w:p>
+      <w:r>
+        <w:t>3. Update the affected link in the "Liens de vente et replay" section.</w:t>
+      </w:r>
+    </w:p>
+    <w:p>
+      <w:r>
+        <w:t>4. Click "Enregistrer les liens" again.</w:t>
+      </w:r>
+    </w:p>
+    <w:p>
+      <w:pPr>
+        <w:pStyle w:val="Heading3"/>
+      </w:pPr>
+      <w:r>
         <w:t>Branching seems incorrect (present vs absent)</w:t>
       </w:r>
     </w:p>
@@ -1444,7 +1632,7 @@
         <w:ind w:left="288" w:hanging="216"/>
       </w:pPr>
       <w:r>
-        <w:t>• Confirm payment URL, booking URL, and replay URLs are filled in the system config.</w:t>
+        <w:t>• Confirm payment URL, booking URL, and replay URLs are filled in `PILOTAGE LIVE` for the active edition.</w:t>
       </w:r>
     </w:p>
     <w:p>

</xml_diff>

<commit_message>
docs: translate client handoff to french
</commit_message>
<xml_diff>
--- a/platform/docs/client-handoff/HANDOFF-CLIENT-CHALLENGE-AMAZON-FBA.docx
+++ b/platform/docs/client-handoff/HANDOFF-CLIENT-CHALLENGE-AMAZON-FBA.docx
@@ -147,7 +147,7 @@
           </w:tcPr>
           <w:p>
             <w:r>
-              <w:t>2026-05-22 16:09</w:t>
+              <w:t>2026-05-22 16:29</w:t>
             </w:r>
           </w:p>
         </w:tc>
@@ -163,7 +163,7 @@
         <w:pStyle w:val="Heading1"/>
       </w:pPr>
       <w:r>
-        <w:t>Client Handoff - Challenge Amazon FBA (WhatsApp Automation)</w:t>
+        <w:t>Document de Remise Client - Challenge Amazon FBA (Automatisation WhatsApp)</w:t>
       </w:r>
     </w:p>
     <w:p>
@@ -171,17 +171,17 @@
         <w:pStyle w:val="Heading2"/>
       </w:pPr>
       <w:r>
-        <w:t>1. Purpose</w:t>
-      </w:r>
-    </w:p>
-    <w:p>
-      <w:r>
-        <w:t>This document is the client-facing handoff for the WhatsApp automation system built for the Amazon FBA live challenge.</w:t>
-      </w:r>
-    </w:p>
-    <w:p>
-      <w:r>
-        <w:t>It explains:</w:t>
+        <w:t>1. Objet du document</w:t>
+      </w:r>
+    </w:p>
+    <w:p>
+      <w:r>
+        <w:t>Ce document est le document de remise client du système d'automatisation WhatsApp construit pour le Challenge Amazon FBA.</w:t>
+      </w:r>
+    </w:p>
+    <w:p>
+      <w:r>
+        <w:t>Il explique :</w:t>
       </w:r>
     </w:p>
     <w:p>
@@ -189,7 +189,7 @@
         <w:ind w:left="288" w:hanging="216"/>
       </w:pPr>
       <w:r>
-        <w:t>• what has been delivered</w:t>
+        <w:t>• ce qui a été livré</w:t>
       </w:r>
     </w:p>
     <w:p>
@@ -197,7 +197,7 @@
         <w:ind w:left="288" w:hanging="216"/>
       </w:pPr>
       <w:r>
-        <w:t>• how to operate the system end-to-end (scaffolding method)</w:t>
+        <w:t>• comment utiliser le système de bout en bout</w:t>
       </w:r>
     </w:p>
     <w:p>
@@ -205,7 +205,7 @@
         <w:ind w:left="288" w:hanging="216"/>
       </w:pPr>
       <w:r>
-        <w:t>• which links and credentials are required (without exposing secrets publicly)</w:t>
+        <w:t>• quels liens et outils doivent être utilisés</w:t>
       </w:r>
     </w:p>
     <w:p>
@@ -213,7 +213,7 @@
         <w:ind w:left="288" w:hanging="216"/>
       </w:pPr>
       <w:r>
-        <w:t>• what to do before / during / after each live</w:t>
+        <w:t>• quoi faire avant, pendant et après chaque live</w:t>
       </w:r>
     </w:p>
     <w:p>
@@ -221,7 +221,7 @@
         <w:ind w:left="288" w:hanging="216"/>
       </w:pPr>
       <w:r>
-        <w:t>• how to validate everything with a minimal test</w:t>
+        <w:t>• comment vérifier que tout fonctionne</w:t>
       </w:r>
     </w:p>
     <w:p>
@@ -229,7 +229,7 @@
         <w:ind w:left="288" w:hanging="216"/>
       </w:pPr>
       <w:r>
-        <w:t>• scaling options (retainer roadmap)</w:t>
+        <w:t>• quelles sont les possibilités d'évolution et de scaling du système</w:t>
       </w:r>
     </w:p>
     <w:p>
@@ -242,7 +242,7 @@
         <w:pStyle w:val="Heading2"/>
       </w:pPr>
       <w:r>
-        <w:t>2. What Has Been Delivered</w:t>
+        <w:t>2. Ce qui a été livré</w:t>
       </w:r>
     </w:p>
     <w:p>
@@ -250,7 +250,7 @@
         <w:pStyle w:val="Heading3"/>
       </w:pPr>
       <w:r>
-        <w:t>2.1 Business outcomes</w:t>
+        <w:t>2.1 Résultat métier</w:t>
       </w:r>
     </w:p>
     <w:p>
@@ -258,7 +258,7 @@
         <w:ind w:left="288" w:hanging="216"/>
       </w:pPr>
       <w:r>
-        <w:t>• Leads are captured from Systeme.io funnels and routed into the platform.</w:t>
+        <w:t>• Les leads sont captés depuis les funnels Systeme.io et injectés dans la plateforme.</w:t>
       </w:r>
     </w:p>
     <w:p>
@@ -266,7 +266,7 @@
         <w:ind w:left="288" w:hanging="216"/>
       </w:pPr>
       <w:r>
-        <w:t>• Contacts are enrolled into the correct cohort (EU / US-CA).</w:t>
+        <w:t>• Les contacts sont enrôlés automatiquement dans la bonne cohorte (`EU` ou `US-CA`).</w:t>
       </w:r>
     </w:p>
     <w:p>
@@ -274,7 +274,7 @@
         <w:ind w:left="288" w:hanging="216"/>
       </w:pPr>
       <w:r>
-        <w:t>• WhatsApp messages are sent via Wati using approved templates.</w:t>
+        <w:t>• Les messages WhatsApp sont envoyés via Wati avec les templates approuvés.</w:t>
       </w:r>
     </w:p>
     <w:p>
@@ -282,7 +282,7 @@
         <w:ind w:left="288" w:hanging="216"/>
       </w:pPr>
       <w:r>
-        <w:t>• Attendance/registration signals drive branching for Day 2/Day 3 and post-live follow-ups.</w:t>
+        <w:t>• Les signaux StreamYard (inscrits / présents) pilotent les branches de relance Jour 2, Jour 3 et post-live.</w:t>
       </w:r>
     </w:p>
     <w:p>
@@ -290,7 +290,7 @@
         <w:ind w:left="288" w:hanging="216"/>
       </w:pPr>
       <w:r>
-        <w:t>• Messages stop automatically after a purchase signal is recorded.</w:t>
+        <w:t>• Les envois s'arrêtent automatiquement après détection d'un achat.</w:t>
       </w:r>
     </w:p>
     <w:p>
@@ -298,7 +298,7 @@
         <w:ind w:left="288" w:hanging="216"/>
       </w:pPr>
       <w:r>
-        <w:t>• A StreamYard operator portal ("PILOTAGE LIVE") allows running the live workflow without SSH/curl.</w:t>
+        <w:t>• Un portail opérateur `PILOTAGE LIVE` permet d'exécuter le workflow live sans SSH, sans Termius et sans commande `curl`.</w:t>
       </w:r>
     </w:p>
     <w:p>
@@ -306,7 +306,7 @@
         <w:pStyle w:val="Heading3"/>
       </w:pPr>
       <w:r>
-        <w:t>2.2 Key components</w:t>
+        <w:t>2.2 Composants principaux</w:t>
       </w:r>
     </w:p>
     <w:p>
@@ -314,7 +314,7 @@
         <w:ind w:left="288" w:hanging="216"/>
       </w:pPr>
       <w:r>
-        <w:t>• WhatsApp messaging provider: Wati (WhatsApp Business)</w:t>
+        <w:t>• WhatsApp Business / envoi des messages : Wati</w:t>
       </w:r>
     </w:p>
     <w:p>
@@ -322,7 +322,7 @@
         <w:ind w:left="288" w:hanging="216"/>
       </w:pPr>
       <w:r>
-        <w:t>• Lead source: Systeme.io funnels (EU + US/CA)</w:t>
+        <w:t>• Source des leads : Systeme.io</w:t>
       </w:r>
     </w:p>
     <w:p>
@@ -330,7 +330,7 @@
         <w:ind w:left="288" w:hanging="216"/>
       </w:pPr>
       <w:r>
-        <w:t>• Orchestration: n8n workflows</w:t>
+        <w:t>• Orchestration : n8n</w:t>
       </w:r>
     </w:p>
     <w:p>
@@ -338,7 +338,7 @@
         <w:ind w:left="288" w:hanging="216"/>
       </w:pPr>
       <w:r>
-        <w:t>• Platform services: API + scheduling + scoring + consent + campaign logic</w:t>
+        <w:t>• Services plateforme : API, scheduler, scoring, consentement, logique campagne</w:t>
       </w:r>
     </w:p>
     <w:p>
@@ -346,7 +346,7 @@
         <w:ind w:left="288" w:hanging="216"/>
       </w:pPr>
       <w:r>
-        <w:t>• Operator UI:</w:t>
+        <w:t>• Interface opérateur :</w:t>
       </w:r>
     </w:p>
     <w:p>
@@ -354,7 +354,7 @@
         <w:ind w:left="288" w:hanging="216"/>
       </w:pPr>
       <w:r>
-        <w:t>• Admin Console (dashboard)</w:t>
+        <w:t>• Console Admin</w:t>
       </w:r>
     </w:p>
     <w:p>
@@ -362,7 +362,7 @@
         <w:ind w:left="288" w:hanging="216"/>
       </w:pPr>
       <w:r>
-        <w:t>• StreamYard Ops Portal ("PILOTAGE LIVE")</w:t>
+        <w:t>• Portail StreamYard `PILOTAGE LIVE`</w:t>
       </w:r>
     </w:p>
     <w:p>
@@ -375,7 +375,7 @@
         <w:pStyle w:val="Heading2"/>
       </w:pPr>
       <w:r>
-        <w:t>3. Definitions (Quick Glossary)</w:t>
+        <w:t>3. Définitions utiles</w:t>
       </w:r>
     </w:p>
     <w:p>
@@ -383,7 +383,7 @@
         <w:ind w:left="288" w:hanging="216"/>
       </w:pPr>
       <w:r>
-        <w:t>• Cohort:</w:t>
+        <w:t>• **Cohorte**</w:t>
       </w:r>
     </w:p>
     <w:p>
@@ -391,7 +391,7 @@
         <w:ind w:left="288" w:hanging="216"/>
       </w:pPr>
       <w:r>
-        <w:t>• `EU` (Paris time)</w:t>
+        <w:t>• `EU`</w:t>
       </w:r>
     </w:p>
     <w:p>
@@ -399,7 +399,7 @@
         <w:ind w:left="288" w:hanging="216"/>
       </w:pPr>
       <w:r>
-        <w:t>• `US-CA` (Montreal time)</w:t>
+        <w:t>• `US-CA`</w:t>
       </w:r>
     </w:p>
     <w:p>
@@ -407,7 +407,7 @@
         <w:ind w:left="288" w:hanging="216"/>
       </w:pPr>
       <w:r>
-        <w:t>• Edition key: a unique identifier for a challenge edition, used to store per-day live links.</w:t>
+        <w:t>• **Edition key**</w:t>
       </w:r>
     </w:p>
     <w:p>
@@ -415,7 +415,7 @@
         <w:ind w:left="288" w:hanging="216"/>
       </w:pPr>
       <w:r>
-        <w:t>• Example: `2026-05-21-usca`</w:t>
+        <w:t>• identifiant unique d'une édition du challenge</w:t>
       </w:r>
     </w:p>
     <w:p>
@@ -423,7 +423,7 @@
         <w:ind w:left="288" w:hanging="216"/>
       </w:pPr>
       <w:r>
-        <w:t>• Day number:</w:t>
+        <w:t>• exemple : `2026-05-21-usca`</w:t>
       </w:r>
     </w:p>
     <w:p>
@@ -431,7 +431,7 @@
         <w:ind w:left="288" w:hanging="216"/>
       </w:pPr>
       <w:r>
-        <w:t>• `1`, `2`, `3` (live session day)</w:t>
+        <w:t>• **Jour**</w:t>
       </w:r>
     </w:p>
     <w:p>
@@ -439,7 +439,7 @@
         <w:ind w:left="288" w:hanging="216"/>
       </w:pPr>
       <w:r>
-        <w:t>• StreamYard states:</w:t>
+        <w:t>• `1`, `2`, `3`</w:t>
       </w:r>
     </w:p>
     <w:p>
@@ -447,7 +447,7 @@
         <w:ind w:left="288" w:hanging="216"/>
       </w:pPr>
       <w:r>
-        <w:t>• attended live</w:t>
+        <w:t>• correspond aux 3 sessions live du challenge</w:t>
       </w:r>
     </w:p>
     <w:p>
@@ -455,7 +455,7 @@
         <w:ind w:left="288" w:hanging="216"/>
       </w:pPr>
       <w:r>
-        <w:t>• registered but absent</w:t>
+        <w:t>• **Template Wati**</w:t>
       </w:r>
     </w:p>
     <w:p>
@@ -463,7 +463,7 @@
         <w:ind w:left="288" w:hanging="216"/>
       </w:pPr>
       <w:r>
-        <w:t>• not registered</w:t>
+        <w:t>• message WhatsApp validé avec variables `{{1}}`, `{{2}}`, `{{3}}`, `{{4}}`</w:t>
       </w:r>
     </w:p>
     <w:p>
@@ -471,7 +471,47 @@
         <w:ind w:left="288" w:hanging="216"/>
       </w:pPr>
       <w:r>
-        <w:t>• Wati template: a WhatsApp-approved message template with placeholders `{{1}}`, `{{2}}`, ...</w:t>
+        <w:t>• **PILOTAGE LIVE**</w:t>
+      </w:r>
+    </w:p>
+    <w:p>
+      <w:pPr>
+        <w:ind w:left="288" w:hanging="216"/>
+      </w:pPr>
+      <w:r>
+        <w:t>• page opérateur utilisée pour :</w:t>
+      </w:r>
+    </w:p>
+    <w:p>
+      <w:pPr>
+        <w:ind w:left="288" w:hanging="216"/>
+      </w:pPr>
+      <w:r>
+        <w:t>• enregistrer le lien StreamYard du jour</w:t>
+      </w:r>
+    </w:p>
+    <w:p>
+      <w:pPr>
+        <w:ind w:left="288" w:hanging="216"/>
+      </w:pPr>
+      <w:r>
+        <w:t>• enregistrer les liens variables de l'édition</w:t>
+      </w:r>
+    </w:p>
+    <w:p>
+      <w:pPr>
+        <w:ind w:left="288" w:hanging="216"/>
+      </w:pPr>
+      <w:r>
+        <w:t>• envoyer les inscrits StreamYard</w:t>
+      </w:r>
+    </w:p>
+    <w:p>
+      <w:pPr>
+        <w:ind w:left="288" w:hanging="216"/>
+      </w:pPr>
+      <w:r>
+        <w:t>• envoyer les présents StreamYard</w:t>
       </w:r>
     </w:p>
     <w:p>
@@ -484,12 +524,7 @@
         <w:pStyle w:val="Heading2"/>
       </w:pPr>
       <w:r>
-        <w:t>4. Required Links (Fill-in Section)</w:t>
-      </w:r>
-    </w:p>
-    <w:p>
-      <w:r>
-        <w:t>Provide these values to the operator team.</w:t>
+        <w:t>4. Liens et accès à utiliser</w:t>
       </w:r>
     </w:p>
     <w:p>
@@ -497,7 +532,7 @@
         <w:pStyle w:val="Heading3"/>
       </w:pPr>
       <w:r>
-        <w:t>4.1 Admin Console (Dashboard)</w:t>
+        <w:t>4.1 Console Admin</w:t>
       </w:r>
     </w:p>
     <w:p>
@@ -505,7 +540,44 @@
         <w:ind w:left="288" w:hanging="216"/>
       </w:pPr>
       <w:r>
-        <w:t>• URL: `http://whatsapp.178.104.229.163.nip.io:3001/`</w:t>
+        <w:t>• URL : `http://whatsapp.178.104.229.163.nip.io:3001/`</w:t>
+      </w:r>
+    </w:p>
+    <w:p>
+      <w:r>
+        <w:t>Utilité :</w:t>
+      </w:r>
+    </w:p>
+    <w:p>
+      <w:pPr>
+        <w:ind w:left="288" w:hanging="216"/>
+      </w:pPr>
+      <w:r>
+        <w:t>• voir l'état général de la plateforme</w:t>
+      </w:r>
+    </w:p>
+    <w:p>
+      <w:pPr>
+        <w:ind w:left="288" w:hanging="216"/>
+      </w:pPr>
+      <w:r>
+        <w:t>• suivre les contacts</w:t>
+      </w:r>
+    </w:p>
+    <w:p>
+      <w:pPr>
+        <w:ind w:left="288" w:hanging="216"/>
+      </w:pPr>
+      <w:r>
+        <w:t>• suivre les messages envoyés</w:t>
+      </w:r>
+    </w:p>
+    <w:p>
+      <w:pPr>
+        <w:ind w:left="288" w:hanging="216"/>
+      </w:pPr>
+      <w:r>
+        <w:t>• suivre les relances humaines</w:t>
       </w:r>
     </w:p>
     <w:p>
@@ -513,7 +585,7 @@
         <w:pStyle w:val="Heading3"/>
       </w:pPr>
       <w:r>
-        <w:t>4.2 StreamYard Ops Portal (PILOTAGE LIVE)</w:t>
+        <w:t>4.2 Portail StreamYard - PILOTAGE LIVE</w:t>
       </w:r>
     </w:p>
     <w:p>
@@ -521,7 +593,12 @@
         <w:ind w:left="288" w:hanging="216"/>
       </w:pPr>
       <w:r>
-        <w:t>• URL (tokenized): `http://whatsapp.178.104.229.163.nip.io:3001/ops/streamyard?token=ops_streamyard_2026_fba_client_x9K4mP2qL7zR`</w:t>
+        <w:t>• URL : `http://whatsapp.178.104.229.163.nip.io:3001/ops/streamyard?token=ops_streamyard_2026_fba_client_x9K4mP2qL7zR`</w:t>
+      </w:r>
+    </w:p>
+    <w:p>
+      <w:r>
+        <w:t>Important :</w:t>
       </w:r>
     </w:p>
     <w:p>
@@ -529,7 +606,15 @@
         <w:ind w:left="288" w:hanging="216"/>
       </w:pPr>
       <w:r>
-        <w:t>• This link must be kept private.</w:t>
+        <w:t>• ce lien doit rester privé</w:t>
+      </w:r>
+    </w:p>
+    <w:p>
+      <w:pPr>
+        <w:ind w:left="288" w:hanging="216"/>
+      </w:pPr>
+      <w:r>
+        <w:t>• il donne accès à l'outil opérateur du challenge</w:t>
       </w:r>
     </w:p>
     <w:p>
@@ -541,11 +626,16 @@
       </w:r>
     </w:p>
     <w:p>
+      <w:r>
+        <w:t>À confirmer côté client :</w:t>
+      </w:r>
+    </w:p>
+    <w:p>
       <w:pPr>
         <w:ind w:left="288" w:hanging="216"/>
       </w:pPr>
       <w:r>
-        <w:t>• Wati workspace: `&lt;WATI_WORKSPACE_NAME&gt;`</w:t>
+        <w:t>• nom du workspace Wati</w:t>
       </w:r>
     </w:p>
     <w:p>
@@ -553,7 +643,59 @@
         <w:ind w:left="288" w:hanging="216"/>
       </w:pPr>
       <w:r>
-        <w:t>• WhatsApp business number connected in Wati: `&lt;WATI_NUMBER&gt;`</w:t>
+        <w:t>• numéro WhatsApp Business connecté</w:t>
+      </w:r>
+    </w:p>
+    <w:p>
+      <w:r>
+        <w:t>Utilité :</w:t>
+      </w:r>
+    </w:p>
+    <w:p>
+      <w:pPr>
+        <w:ind w:left="288" w:hanging="216"/>
+      </w:pPr>
+      <w:r>
+        <w:t>• recevoir les réponses des leads</w:t>
+      </w:r>
+    </w:p>
+    <w:p>
+      <w:pPr>
+        <w:ind w:left="288" w:hanging="216"/>
+      </w:pPr>
+      <w:r>
+        <w:t>• répondre manuellement si nécessaire</w:t>
+      </w:r>
+    </w:p>
+    <w:p>
+      <w:pPr>
+        <w:ind w:left="288" w:hanging="216"/>
+      </w:pPr>
+      <w:r>
+        <w:t>• surveiller les conversations et notifications</w:t>
+      </w:r>
+    </w:p>
+    <w:p>
+      <w:r>
+        <w:t>---</w:t>
+      </w:r>
+    </w:p>
+    <w:p>
+      <w:pPr>
+        <w:pStyle w:val="Heading2"/>
+      </w:pPr>
+      <w:r>
+        <w:t>5. Liens variables à renseigner pour chaque édition</w:t>
+      </w:r>
+    </w:p>
+    <w:p>
+      <w:r>
+        <w:t>Ces liens ne sont pas stockés comme une configuration fixe globale.</w:t>
+      </w:r>
+    </w:p>
+    <w:p>
+      <w:r>
+        <w:t>Ils sont maintenant gérés **par édition**, directement depuis `PILOTAGE LIVE`.</w:t>
       </w:r>
     </w:p>
     <w:p>
@@ -561,7 +703,7 @@
         <w:pStyle w:val="Heading3"/>
       </w:pPr>
       <w:r>
-        <w:t>4.4 Payment + Booking + Replays</w:t>
+        <w:t>5.1 Liens à prévoir</w:t>
       </w:r>
     </w:p>
     <w:p>
@@ -569,7 +711,7 @@
         <w:ind w:left="288" w:hanging="216"/>
       </w:pPr>
       <w:r>
-        <w:t>• Payment page URL (Day 3 offer): `A RENSEIGNER`</w:t>
+        <w:t>• lien de paiement de l'offre Jour 3</w:t>
       </w:r>
     </w:p>
     <w:p>
@@ -577,7 +719,7 @@
         <w:ind w:left="288" w:hanging="216"/>
       </w:pPr>
       <w:r>
-        <w:t>• Booking link (closer call): `A RENSEIGNER`</w:t>
+        <w:t>• lien de réservation / closer</w:t>
       </w:r>
     </w:p>
     <w:p>
@@ -585,7 +727,7 @@
         <w:ind w:left="288" w:hanging="216"/>
       </w:pPr>
       <w:r>
-        <w:t>• Replay Day 1 URL: `A RENSEIGNER`</w:t>
+        <w:t>• lien replay Jour 1</w:t>
       </w:r>
     </w:p>
     <w:p>
@@ -593,7 +735,7 @@
         <w:ind w:left="288" w:hanging="216"/>
       </w:pPr>
       <w:r>
-        <w:t>• Replay Day 2 URL: `A RENSEIGNER`</w:t>
+        <w:t>• lien replay Jour 2</w:t>
       </w:r>
     </w:p>
     <w:p>
@@ -601,12 +743,15 @@
         <w:ind w:left="288" w:hanging="216"/>
       </w:pPr>
       <w:r>
-        <w:t>• Replay Day 3 URL: `A RENSEIGNER`</w:t>
-      </w:r>
-    </w:p>
-    <w:p>
-      <w:r>
-        <w:t>Where these URLs are used:</w:t>
+        <w:t>• lien replay Jour 3</w:t>
+      </w:r>
+    </w:p>
+    <w:p>
+      <w:pPr>
+        <w:pStyle w:val="Heading3"/>
+      </w:pPr>
+      <w:r>
+        <w:t>5.2 Où ces liens sont utilisés</w:t>
       </w:r>
     </w:p>
     <w:p>
@@ -614,7 +759,7 @@
         <w:ind w:left="288" w:hanging="216"/>
       </w:pPr>
       <w:r>
-        <w:t>• Payment URL is injected into the Day 3 offer template (`live_day3_offer_hplus2`) as `{{2}}`.</w:t>
+        <w:t>• **Lien paiement**</w:t>
       </w:r>
     </w:p>
     <w:p>
@@ -622,7 +767,7 @@
         <w:ind w:left="288" w:hanging="216"/>
       </w:pPr>
       <w:r>
-        <w:t>• Booking URL is injected into `post_closer_call` and `post_recap_attended` as `{{2}}`.</w:t>
+        <w:t>• utilisé dans le template `live_day3_offer_hplus2`</w:t>
       </w:r>
     </w:p>
     <w:p>
@@ -630,7 +775,7 @@
         <w:ind w:left="288" w:hanging="216"/>
       </w:pPr>
       <w:r>
-        <w:t>• Replay URLs are injected into:</w:t>
+        <w:t>• **Lien closer / réservation**</w:t>
       </w:r>
     </w:p>
     <w:p>
@@ -638,7 +783,7 @@
         <w:ind w:left="288" w:hanging="216"/>
       </w:pPr>
       <w:r>
-        <w:t>• `post_recap_registered_absent` (`{{2}}`, `{{3}}`, `{{4}}`)</w:t>
+        <w:t>• utilisé dans :</w:t>
       </w:r>
     </w:p>
     <w:p>
@@ -646,12 +791,7 @@
         <w:ind w:left="288" w:hanging="216"/>
       </w:pPr>
       <w:r>
-        <w:t>• `post_recap_not_registered` (`{{2}}`, `{{3}}`, `{{4}}`)</w:t>
-      </w:r>
-    </w:p>
-    <w:p>
-      <w:r>
-        <w:t>Notes:</w:t>
+        <w:t>• `post_closer_call`</w:t>
       </w:r>
     </w:p>
     <w:p>
@@ -659,7 +799,7 @@
         <w:ind w:left="288" w:hanging="216"/>
       </w:pPr>
       <w:r>
-        <w:t>• These links are configured directly in the `PILOTAGE LIVE` portal, for the relevant edition.</w:t>
+        <w:t>• `post_recap_attended`</w:t>
       </w:r>
     </w:p>
     <w:p>
@@ -667,7 +807,68 @@
         <w:ind w:left="288" w:hanging="216"/>
       </w:pPr>
       <w:r>
-        <w:t>• You can go live without replays configured (post-live recap will not contain links yet), but payment + closer booking should be configured before Day 3.</w:t>
+        <w:t>• **Liens replay**</w:t>
+      </w:r>
+    </w:p>
+    <w:p>
+      <w:pPr>
+        <w:ind w:left="288" w:hanging="216"/>
+      </w:pPr>
+      <w:r>
+        <w:t>• utilisés dans :</w:t>
+      </w:r>
+    </w:p>
+    <w:p>
+      <w:pPr>
+        <w:ind w:left="288" w:hanging="216"/>
+      </w:pPr>
+      <w:r>
+        <w:t>• `post_recap_registered_absent`</w:t>
+      </w:r>
+    </w:p>
+    <w:p>
+      <w:pPr>
+        <w:ind w:left="288" w:hanging="216"/>
+      </w:pPr>
+      <w:r>
+        <w:t>• `post_recap_not_registered`</w:t>
+      </w:r>
+    </w:p>
+    <w:p>
+      <w:pPr>
+        <w:pStyle w:val="Heading3"/>
+      </w:pPr>
+      <w:r>
+        <w:t>5.3 Règle importante</w:t>
+      </w:r>
+    </w:p>
+    <w:p>
+      <w:r>
+        <w:t>Ces liens doivent être renseignés pour **chaque nouvelle édition** si :</w:t>
+      </w:r>
+    </w:p>
+    <w:p>
+      <w:pPr>
+        <w:ind w:left="288" w:hanging="216"/>
+      </w:pPr>
+      <w:r>
+        <w:t>• l'offre change</w:t>
+      </w:r>
+    </w:p>
+    <w:p>
+      <w:pPr>
+        <w:ind w:left="288" w:hanging="216"/>
+      </w:pPr>
+      <w:r>
+        <w:t>• le lien closer change</w:t>
+      </w:r>
+    </w:p>
+    <w:p>
+      <w:pPr>
+        <w:ind w:left="288" w:hanging="216"/>
+      </w:pPr>
+      <w:r>
+        <w:t>• les liens replay changent</w:t>
       </w:r>
     </w:p>
     <w:p>
@@ -680,7 +881,211 @@
         <w:pStyle w:val="Heading2"/>
       </w:pPr>
       <w:r>
-        <w:t>5. Templates (Wati)</w:t>
+        <w:t>6. Templates Wati attendus</w:t>
+      </w:r>
+    </w:p>
+    <w:p>
+      <w:r>
+        <w:t>Le système a été aligné sur les templates Wati validés / prévus, notamment :</w:t>
+      </w:r>
+    </w:p>
+    <w:p>
+      <w:pPr>
+        <w:ind w:left="288" w:hanging="216"/>
+      </w:pPr>
+      <w:r>
+        <w:t>• `welcome`</w:t>
+      </w:r>
+    </w:p>
+    <w:p>
+      <w:pPr>
+        <w:ind w:left="288" w:hanging="216"/>
+      </w:pPr>
+      <w:r>
+        <w:t>• `countdown_j6` à `countdown_j1`</w:t>
+      </w:r>
+    </w:p>
+    <w:p>
+      <w:pPr>
+        <w:ind w:left="288" w:hanging="216"/>
+      </w:pPr>
+      <w:r>
+        <w:t>• `live_day1`</w:t>
+      </w:r>
+    </w:p>
+    <w:p>
+      <w:pPr>
+        <w:ind w:left="288" w:hanging="216"/>
+      </w:pPr>
+      <w:r>
+        <w:t>• `live_day1_h10`</w:t>
+      </w:r>
+    </w:p>
+    <w:p>
+      <w:pPr>
+        <w:ind w:left="288" w:hanging="216"/>
+      </w:pPr>
+      <w:r>
+        <w:t>• `live_day1_hplus5`</w:t>
+      </w:r>
+    </w:p>
+    <w:p>
+      <w:pPr>
+        <w:ind w:left="288" w:hanging="216"/>
+      </w:pPr>
+      <w:r>
+        <w:t>• `live_day2_attended_v2`</w:t>
+      </w:r>
+    </w:p>
+    <w:p>
+      <w:pPr>
+        <w:ind w:left="288" w:hanging="216"/>
+      </w:pPr>
+      <w:r>
+        <w:t>• `live_day2_registered_absent`</w:t>
+      </w:r>
+    </w:p>
+    <w:p>
+      <w:pPr>
+        <w:ind w:left="288" w:hanging="216"/>
+      </w:pPr>
+      <w:r>
+        <w:t>• `live_day2_not_registered`</w:t>
+      </w:r>
+    </w:p>
+    <w:p>
+      <w:pPr>
+        <w:ind w:left="288" w:hanging="216"/>
+      </w:pPr>
+      <w:r>
+        <w:t>• `live_day2_h10`</w:t>
+      </w:r>
+    </w:p>
+    <w:p>
+      <w:pPr>
+        <w:ind w:left="288" w:hanging="216"/>
+      </w:pPr>
+      <w:r>
+        <w:t>• `live_day2_hplus5`</w:t>
+      </w:r>
+    </w:p>
+    <w:p>
+      <w:pPr>
+        <w:ind w:left="288" w:hanging="216"/>
+      </w:pPr>
+      <w:r>
+        <w:t>• `live_day3_attended_v2`</w:t>
+      </w:r>
+    </w:p>
+    <w:p>
+      <w:pPr>
+        <w:ind w:left="288" w:hanging="216"/>
+      </w:pPr>
+      <w:r>
+        <w:t>• `live_day3_registered_absent`</w:t>
+      </w:r>
+    </w:p>
+    <w:p>
+      <w:pPr>
+        <w:ind w:left="288" w:hanging="216"/>
+      </w:pPr>
+      <w:r>
+        <w:t>• `live_day3_not_registered`</w:t>
+      </w:r>
+    </w:p>
+    <w:p>
+      <w:pPr>
+        <w:ind w:left="288" w:hanging="216"/>
+      </w:pPr>
+      <w:r>
+        <w:t>• `live_day3_h10`</w:t>
+      </w:r>
+    </w:p>
+    <w:p>
+      <w:pPr>
+        <w:ind w:left="288" w:hanging="216"/>
+      </w:pPr>
+      <w:r>
+        <w:t>• `live_day3_hplus5`</w:t>
+      </w:r>
+    </w:p>
+    <w:p>
+      <w:pPr>
+        <w:ind w:left="288" w:hanging="216"/>
+      </w:pPr>
+      <w:r>
+        <w:t>• `live_day3_offer_hplus2`</w:t>
+      </w:r>
+    </w:p>
+    <w:p>
+      <w:pPr>
+        <w:ind w:left="288" w:hanging="216"/>
+      </w:pPr>
+      <w:r>
+        <w:t>• `post_recap_attended`</w:t>
+      </w:r>
+    </w:p>
+    <w:p>
+      <w:pPr>
+        <w:ind w:left="288" w:hanging="216"/>
+      </w:pPr>
+      <w:r>
+        <w:t>• `post_recap_registered_absent`</w:t>
+      </w:r>
+    </w:p>
+    <w:p>
+      <w:pPr>
+        <w:ind w:left="288" w:hanging="216"/>
+      </w:pPr>
+      <w:r>
+        <w:t>• `post_recap_not_registered`</w:t>
+      </w:r>
+    </w:p>
+    <w:p>
+      <w:pPr>
+        <w:ind w:left="288" w:hanging="216"/>
+      </w:pPr>
+      <w:r>
+        <w:t>• `post_inaction_reason`</w:t>
+      </w:r>
+    </w:p>
+    <w:p>
+      <w:pPr>
+        <w:ind w:left="288" w:hanging="216"/>
+      </w:pPr>
+      <w:r>
+        <w:t>• `post_closer_call`</w:t>
+      </w:r>
+    </w:p>
+    <w:p>
+      <w:r>
+        <w:t>Remarque :</w:t>
+      </w:r>
+    </w:p>
+    <w:p>
+      <w:pPr>
+        <w:ind w:left="288" w:hanging="216"/>
+      </w:pPr>
+      <w:r>
+        <w:t>• `post_testimonials` reste optionnel selon disponibilité du contenu réel</w:t>
+      </w:r>
+    </w:p>
+    <w:p>
+      <w:r>
+        <w:t>---</w:t>
+      </w:r>
+    </w:p>
+    <w:p>
+      <w:pPr>
+        <w:pStyle w:val="Heading2"/>
+      </w:pPr>
+      <w:r>
+        <w:t>7. Procédure d'utilisation complète</w:t>
+      </w:r>
+    </w:p>
+    <w:p>
+      <w:r>
+        <w:t>Cette partie est écrite pour permettre une utilisation autonome, sans intervention technique.</w:t>
       </w:r>
     </w:p>
     <w:p>
@@ -688,7 +1093,37 @@
         <w:pStyle w:val="Heading3"/>
       </w:pPr>
       <w:r>
-        <w:t>5.1 Template rules</w:t>
+        <w:t>Etape 1 - Vérifier Wati</w:t>
+      </w:r>
+    </w:p>
+    <w:p>
+      <w:r>
+        <w:t>Avant de lancer une édition :</w:t>
+      </w:r>
+    </w:p>
+    <w:p>
+      <w:r>
+        <w:t>1. Ouvrir Wati</w:t>
+      </w:r>
+    </w:p>
+    <w:p>
+      <w:r>
+        <w:t>2. Vérifier que le numéro WhatsApp Business est bien connecté</w:t>
+      </w:r>
+    </w:p>
+    <w:p>
+      <w:r>
+        <w:t>3. Vérifier que les templates nécessaires sont approuvés</w:t>
+      </w:r>
+    </w:p>
+    <w:p>
+      <w:r>
+        <w:t>4. Vérifier que l'inbox Wati est accessible</w:t>
+      </w:r>
+    </w:p>
+    <w:p>
+      <w:r>
+        <w:t>Vérification conseillée :</w:t>
       </w:r>
     </w:p>
     <w:p>
@@ -696,7 +1131,40 @@
         <w:ind w:left="288" w:hanging="216"/>
       </w:pPr>
       <w:r>
-        <w:t>• Category: Marketing</w:t>
+        <w:t>• envoyer un test manuel sur un numéro de test</w:t>
+      </w:r>
+    </w:p>
+    <w:p>
+      <w:pPr>
+        <w:pStyle w:val="Heading3"/>
+      </w:pPr>
+      <w:r>
+        <w:t>Etape 2 - Vérifier Systeme.io</w:t>
+      </w:r>
+    </w:p>
+    <w:p>
+      <w:r>
+        <w:t>Pour chaque funnel actif :</w:t>
+      </w:r>
+    </w:p>
+    <w:p>
+      <w:r>
+        <w:t>1. Ouvrir le funnel Systeme.io</w:t>
+      </w:r>
+    </w:p>
+    <w:p>
+      <w:r>
+        <w:t>2. Aller sur la page d'opt-in</w:t>
+      </w:r>
+    </w:p>
+    <w:p>
+      <w:r>
+        <w:t>3. Vérifier que la règle d'automatisation webhook existe bien</w:t>
+      </w:r>
+    </w:p>
+    <w:p>
+      <w:r>
+        <w:t>Funnels concernés :</w:t>
       </w:r>
     </w:p>
     <w:p>
@@ -704,7 +1172,7 @@
         <w:ind w:left="288" w:hanging="216"/>
       </w:pPr>
       <w:r>
-        <w:t>• Language: French</w:t>
+        <w:t>• funnel EU</w:t>
       </w:r>
     </w:p>
     <w:p>
@@ -712,7 +1180,12 @@
         <w:ind w:left="288" w:hanging="216"/>
       </w:pPr>
       <w:r>
-        <w:t>• No buttons (unless explicitly requested later)</w:t>
+        <w:t>• funnel US/CA</w:t>
+      </w:r>
+    </w:p>
+    <w:p>
+      <w:r>
+        <w:t>Effet attendu :</w:t>
       </w:r>
     </w:p>
     <w:p>
@@ -720,7 +1193,7 @@
         <w:ind w:left="288" w:hanging="216"/>
       </w:pPr>
       <w:r>
-        <w:t>• Placeholders: `{{1}}`, `{{2}}`, `{{3}}`, `{{4}}`</w:t>
+        <w:t>• à chaque inscription, le contact est créé dans la plateforme</w:t>
       </w:r>
     </w:p>
     <w:p>
@@ -728,7 +1201,7 @@
         <w:ind w:left="288" w:hanging="216"/>
       </w:pPr>
       <w:r>
-        <w:t>• Always provide sample content when creating templates</w:t>
+        <w:t>• le `welcome` est envoyé automatiquement</w:t>
       </w:r>
     </w:p>
     <w:p>
@@ -736,12 +1209,93 @@
         <w:pStyle w:val="Heading3"/>
       </w:pPr>
       <w:r>
-        <w:t>5.2 Expected template set</w:t>
-      </w:r>
-    </w:p>
-    <w:p>
-      <w:r>
-        <w:t>The platform expects the Wati template keys already created and aligned, including (non-exhaustive):</w:t>
+        <w:t>Etape 3 - Préparer les lives StreamYard</w:t>
+      </w:r>
+    </w:p>
+    <w:p>
+      <w:r>
+        <w:t>Pour chaque cohorte et chaque jour :</w:t>
+      </w:r>
+    </w:p>
+    <w:p>
+      <w:r>
+        <w:t>1. créer ou vérifier le live StreamYard</w:t>
+      </w:r>
+    </w:p>
+    <w:p>
+      <w:r>
+        <w:t>2. récupérer le lien du live</w:t>
+      </w:r>
+    </w:p>
+    <w:p>
+      <w:r>
+        <w:t>3. préparer la liste des inscrits</w:t>
+      </w:r>
+    </w:p>
+    <w:p>
+      <w:r>
+        <w:t>4. après le live, préparer la liste des présents</w:t>
+      </w:r>
+    </w:p>
+    <w:p>
+      <w:r>
+        <w:t>---</w:t>
+      </w:r>
+    </w:p>
+    <w:p>
+      <w:pPr>
+        <w:pStyle w:val="Heading2"/>
+      </w:pPr>
+      <w:r>
+        <w:t>8. Utilisation du portail PILOTAGE LIVE</w:t>
+      </w:r>
+    </w:p>
+    <w:p>
+      <w:pPr>
+        <w:pStyle w:val="Heading3"/>
+      </w:pPr>
+      <w:r>
+        <w:t>8.1 Avant le live - enregistrer le lien du jour</w:t>
+      </w:r>
+    </w:p>
+    <w:p>
+      <w:r>
+        <w:t>À faire pour chaque cohorte et chaque jour.</w:t>
+      </w:r>
+    </w:p>
+    <w:p>
+      <w:r>
+        <w:t>1. Ouvrir `PILOTAGE LIVE`</w:t>
+      </w:r>
+    </w:p>
+    <w:p>
+      <w:r>
+        <w:t>2. Choisir la cohorte</w:t>
+      </w:r>
+    </w:p>
+    <w:p>
+      <w:r>
+        <w:t>3. Renseigner `edition_key`</w:t>
+      </w:r>
+    </w:p>
+    <w:p>
+      <w:r>
+        <w:t>4. Choisir le jour (`1`, `2` ou `3`)</w:t>
+      </w:r>
+    </w:p>
+    <w:p>
+      <w:r>
+        <w:t>5. Coller le lien StreamYard du jour</w:t>
+      </w:r>
+    </w:p>
+    <w:p>
+      <w:r>
+        <w:t>6. Cliquer sur **Enregistrer le live**</w:t>
+      </w:r>
+    </w:p>
+    <w:p>
+      <w:r>
+        <w:t>Effet :</w:t>
       </w:r>
     </w:p>
     <w:p>
@@ -749,7 +1303,35 @@
         <w:ind w:left="288" w:hanging="216"/>
       </w:pPr>
       <w:r>
-        <w:t>• `welcome`</w:t>
+        <w:t>• les rappels live utiliseront le bon lien StreamYard</w:t>
+      </w:r>
+    </w:p>
+    <w:p>
+      <w:pPr>
+        <w:pStyle w:val="Heading3"/>
+      </w:pPr>
+      <w:r>
+        <w:t>8.2 Avant l'offre et le post-live - enregistrer les liens variables</w:t>
+      </w:r>
+    </w:p>
+    <w:p>
+      <w:r>
+        <w:t>À faire une fois par édition, puis à mettre à jour si les liens changent.</w:t>
+      </w:r>
+    </w:p>
+    <w:p>
+      <w:r>
+        <w:t>1. Rester sur `PILOTAGE LIVE`</w:t>
+      </w:r>
+    </w:p>
+    <w:p>
+      <w:r>
+        <w:t>2. Garder la bonne cohorte et la bonne `edition_key`</w:t>
+      </w:r>
+    </w:p>
+    <w:p>
+      <w:r>
+        <w:t>3. Renseigner :</w:t>
       </w:r>
     </w:p>
     <w:p>
@@ -757,7 +1339,7 @@
         <w:ind w:left="288" w:hanging="216"/>
       </w:pPr>
       <w:r>
-        <w:t>• `countdown_j6` ... `countdown_j1`</w:t>
+        <w:t>• lien paiement</w:t>
       </w:r>
     </w:p>
     <w:p>
@@ -765,7 +1347,7 @@
         <w:ind w:left="288" w:hanging="216"/>
       </w:pPr>
       <w:r>
-        <w:t>• `live_day1`, `live_day1_h10`, `live_day1_hplus5`</w:t>
+        <w:t>• lien closer / réservation</w:t>
       </w:r>
     </w:p>
     <w:p>
@@ -773,7 +1355,7 @@
         <w:ind w:left="288" w:hanging="216"/>
       </w:pPr>
       <w:r>
-        <w:t>• `live_day2_attended_v2`, `live_day2_registered_absent`, `live_day2_not_registered`, `live_day2_h10`, `live_day2_hplus5`</w:t>
+        <w:t>• replay Jour 1</w:t>
       </w:r>
     </w:p>
     <w:p>
@@ -781,7 +1363,7 @@
         <w:ind w:left="288" w:hanging="216"/>
       </w:pPr>
       <w:r>
-        <w:t>• `live_day3_attended_v2`, `live_day3_registered_absent`, `live_day3_not_registered`, `live_day3_h10`, `live_day3_hplus5`</w:t>
+        <w:t>• replay Jour 2</w:t>
       </w:r>
     </w:p>
     <w:p>
@@ -789,7 +1371,17 @@
         <w:ind w:left="288" w:hanging="216"/>
       </w:pPr>
       <w:r>
-        <w:t>• `live_day3_offer_hplus2`</w:t>
+        <w:t>• replay Jour 3</w:t>
+      </w:r>
+    </w:p>
+    <w:p>
+      <w:r>
+        <w:t>4. Cliquer sur **Enregistrer les liens**</w:t>
+      </w:r>
+    </w:p>
+    <w:p>
+      <w:r>
+        <w:t>Effet :</w:t>
       </w:r>
     </w:p>
     <w:p>
@@ -797,7 +1389,7 @@
         <w:ind w:left="288" w:hanging="216"/>
       </w:pPr>
       <w:r>
-        <w:t>• `post_recap_attended`, `post_recap_registered_absent`, `post_recap_not_registered`</w:t>
+        <w:t>• les messages d'offre Jour 3 utilisent le bon lien paiement</w:t>
       </w:r>
     </w:p>
     <w:p>
@@ -805,7 +1397,7 @@
         <w:ind w:left="288" w:hanging="216"/>
       </w:pPr>
       <w:r>
-        <w:t>• `post_inaction_reason`</w:t>
+        <w:t>• les messages post-live utilisent les bons replays</w:t>
       </w:r>
     </w:p>
     <w:p>
@@ -813,7 +1405,35 @@
         <w:ind w:left="288" w:hanging="216"/>
       </w:pPr>
       <w:r>
-        <w:t>• `post_closer_call`</w:t>
+        <w:t>• les messages closer utilisent le bon lien de réservation</w:t>
+      </w:r>
+    </w:p>
+    <w:p>
+      <w:pPr>
+        <w:pStyle w:val="Heading3"/>
+      </w:pPr>
+      <w:r>
+        <w:t>8.3 Juste avant le live - envoyer les inscrits</w:t>
+      </w:r>
+    </w:p>
+    <w:p>
+      <w:r>
+        <w:t>1. Exporter ou récupérer les inscrits StreamYard</w:t>
+      </w:r>
+    </w:p>
+    <w:p>
+      <w:r>
+        <w:t>2. Les coller dans la zone prévue ou importer un CSV</w:t>
+      </w:r>
+    </w:p>
+    <w:p>
+      <w:r>
+        <w:t>3. Cliquer sur **Envoyer les inscrits**</w:t>
+      </w:r>
+    </w:p>
+    <w:p>
+      <w:r>
+        <w:t>Effet :</w:t>
       </w:r>
     </w:p>
     <w:p>
@@ -821,7 +1441,88 @@
         <w:ind w:left="288" w:hanging="216"/>
       </w:pPr>
       <w:r>
-        <w:t>• `post_testimonials` (optional, only when filled with real testimonials)</w:t>
+        <w:t>• le système saura distinguer :</w:t>
+      </w:r>
+    </w:p>
+    <w:p>
+      <w:pPr>
+        <w:ind w:left="288" w:hanging="216"/>
+      </w:pPr>
+      <w:r>
+        <w:t>• les inscrits absents</w:t>
+      </w:r>
+    </w:p>
+    <w:p>
+      <w:pPr>
+        <w:ind w:left="288" w:hanging="216"/>
+      </w:pPr>
+      <w:r>
+        <w:t>• les non inscrits</w:t>
+      </w:r>
+    </w:p>
+    <w:p>
+      <w:pPr>
+        <w:pStyle w:val="Heading3"/>
+      </w:pPr>
+      <w:r>
+        <w:t>8.4 Après le live - envoyer les présents</w:t>
+      </w:r>
+    </w:p>
+    <w:p>
+      <w:r>
+        <w:t>1. Exporter ou récupérer les présents</w:t>
+      </w:r>
+    </w:p>
+    <w:p>
+      <w:r>
+        <w:t>2. Les coller dans la zone prévue ou importer un CSV</w:t>
+      </w:r>
+    </w:p>
+    <w:p>
+      <w:r>
+        <w:t>3. Cliquer sur **Envoyer les présents**</w:t>
+      </w:r>
+    </w:p>
+    <w:p>
+      <w:r>
+        <w:t>Effet :</w:t>
+      </w:r>
+    </w:p>
+    <w:p>
+      <w:pPr>
+        <w:ind w:left="288" w:hanging="216"/>
+      </w:pPr>
+      <w:r>
+        <w:t>• le système saura distinguer :</w:t>
+      </w:r>
+    </w:p>
+    <w:p>
+      <w:pPr>
+        <w:ind w:left="288" w:hanging="216"/>
+      </w:pPr>
+      <w:r>
+        <w:t>• les présents</w:t>
+      </w:r>
+    </w:p>
+    <w:p>
+      <w:pPr>
+        <w:ind w:left="288" w:hanging="216"/>
+      </w:pPr>
+      <w:r>
+        <w:t>• les inscrits absents</w:t>
+      </w:r>
+    </w:p>
+    <w:p>
+      <w:pPr>
+        <w:ind w:left="288" w:hanging="216"/>
+      </w:pPr>
+      <w:r>
+        <w:t>• les non inscrits</w:t>
+      </w:r>
+    </w:p>
+    <w:p>
+      <w:r>
+        <w:t>Cela permet d'envoyer la bonne relance au bon contact.</w:t>
       </w:r>
     </w:p>
     <w:p>
@@ -834,12 +1535,7 @@
         <w:pStyle w:val="Heading2"/>
       </w:pPr>
       <w:r>
-        <w:t>6. Operating the System (Scaffolding Method)</w:t>
-      </w:r>
-    </w:p>
-    <w:p>
-      <w:r>
-        <w:t>This section is written so the client can execute without technical support.</w:t>
+        <w:t>9. Vérifications recommandées</w:t>
       </w:r>
     </w:p>
     <w:p>
@@ -847,27 +1543,17 @@
         <w:pStyle w:val="Heading3"/>
       </w:pPr>
       <w:r>
-        <w:t>Step 1 - Confirm Wati is ready</w:t>
-      </w:r>
-    </w:p>
-    <w:p>
-      <w:r>
-        <w:t>1. Open Wati.</w:t>
-      </w:r>
-    </w:p>
-    <w:p>
-      <w:r>
-        <w:t>2. Confirm the WhatsApp Business number is connected and "online".</w:t>
-      </w:r>
-    </w:p>
-    <w:p>
-      <w:r>
-        <w:t>3. Confirm required templates are approved/available.</w:t>
-      </w:r>
-    </w:p>
-    <w:p>
-      <w:r>
-        <w:t>Validation:</w:t>
+        <w:t>9.1 Vérification simple à faire avant une vraie édition</w:t>
+      </w:r>
+    </w:p>
+    <w:p>
+      <w:r>
+        <w:t>1. Faire une inscription test sur le funnel</w:t>
+      </w:r>
+    </w:p>
+    <w:p>
+      <w:r>
+        <w:t>2. Vérifier :</w:t>
       </w:r>
     </w:p>
     <w:p>
@@ -875,7 +1561,52 @@
         <w:ind w:left="288" w:hanging="216"/>
       </w:pPr>
       <w:r>
-        <w:t>• Send a manual test template (`welcome`) to a test number (not the business number itself).</w:t>
+        <w:t>• création du contact</w:t>
+      </w:r>
+    </w:p>
+    <w:p>
+      <w:pPr>
+        <w:ind w:left="288" w:hanging="216"/>
+      </w:pPr>
+      <w:r>
+        <w:t>• enrôlement</w:t>
+      </w:r>
+    </w:p>
+    <w:p>
+      <w:pPr>
+        <w:ind w:left="288" w:hanging="216"/>
+      </w:pPr>
+      <w:r>
+        <w:t>• envoi du `welcome`</w:t>
+      </w:r>
+    </w:p>
+    <w:p>
+      <w:r>
+        <w:t>3. Tester `PILOTAGE LIVE` avec :</w:t>
+      </w:r>
+    </w:p>
+    <w:p>
+      <w:pPr>
+        <w:ind w:left="288" w:hanging="216"/>
+      </w:pPr>
+      <w:r>
+        <w:t>• un lien StreamYard</w:t>
+      </w:r>
+    </w:p>
+    <w:p>
+      <w:pPr>
+        <w:ind w:left="288" w:hanging="216"/>
+      </w:pPr>
+      <w:r>
+        <w:t>• des inscrits</w:t>
+      </w:r>
+    </w:p>
+    <w:p>
+      <w:pPr>
+        <w:ind w:left="288" w:hanging="216"/>
+      </w:pPr>
+      <w:r>
+        <w:t>• des présents</w:t>
       </w:r>
     </w:p>
     <w:p>
@@ -883,32 +1614,12 @@
         <w:pStyle w:val="Heading3"/>
       </w:pPr>
       <w:r>
-        <w:t>Step 2 - Confirm Systeme.io funnels are connected</w:t>
-      </w:r>
-    </w:p>
-    <w:p>
-      <w:r>
-        <w:t>For each active funnel (EU / US-CA):</w:t>
-      </w:r>
-    </w:p>
-    <w:p>
-      <w:r>
-        <w:t>1. Open Systeme.io funnel step (opt-in page).</w:t>
-      </w:r>
-    </w:p>
-    <w:p>
-      <w:r>
-        <w:t>2. Open Automation Rules.</w:t>
-      </w:r>
-    </w:p>
-    <w:p>
-      <w:r>
-        <w:t>3. Ensure a webhook action is configured (do not remove existing tracking rules).</w:t>
-      </w:r>
-    </w:p>
-    <w:p>
-      <w:r>
-        <w:t>Validation:</w:t>
+        <w:t>9.2 Vérification pendant l'exploitation</w:t>
+      </w:r>
+    </w:p>
+    <w:p>
+      <w:r>
+        <w:t>Surveiller :</w:t>
       </w:r>
     </w:p>
     <w:p>
@@ -916,7 +1627,7 @@
         <w:ind w:left="288" w:hanging="216"/>
       </w:pPr>
       <w:r>
-        <w:t>• Submit a test opt-in.</w:t>
+        <w:t>• Wati Inbox</w:t>
       </w:r>
     </w:p>
     <w:p>
@@ -924,7 +1635,36 @@
         <w:ind w:left="288" w:hanging="216"/>
       </w:pPr>
       <w:r>
-        <w:t>• Confirm a WhatsApp `welcome` arrives.</w:t>
+        <w:t>• Console Admin</w:t>
+      </w:r>
+    </w:p>
+    <w:p>
+      <w:pPr>
+        <w:ind w:left="288" w:hanging="216"/>
+      </w:pPr>
+      <w:r>
+        <w:t>• nombre de messages envoyés</w:t>
+      </w:r>
+    </w:p>
+    <w:p>
+      <w:pPr>
+        <w:ind w:left="288" w:hanging="216"/>
+      </w:pPr>
+      <w:r>
+        <w:t>• file de relances humaines</w:t>
+      </w:r>
+    </w:p>
+    <w:p>
+      <w:r>
+        <w:t>---</w:t>
+      </w:r>
+    </w:p>
+    <w:p>
+      <w:pPr>
+        <w:pStyle w:val="Heading2"/>
+      </w:pPr>
+      <w:r>
+        <w:t>10. Que faire si quelque chose semble incorrect</w:t>
       </w:r>
     </w:p>
     <w:p>
@@ -932,27 +1672,129 @@
         <w:pStyle w:val="Heading3"/>
       </w:pPr>
       <w:r>
-        <w:t>Step 3 - Create/verify StreamYard lives</w:t>
-      </w:r>
-    </w:p>
-    <w:p>
-      <w:r>
-        <w:t>For each cohort (EU / US-CA) and each day (1..3):</w:t>
-      </w:r>
-    </w:p>
-    <w:p>
-      <w:r>
-        <w:t>1. Create/verify the StreamYard live.</w:t>
-      </w:r>
-    </w:p>
-    <w:p>
-      <w:r>
-        <w:t>2. Copy the watch/join URL.</w:t>
-      </w:r>
-    </w:p>
-    <w:p>
-      <w:r>
-        <w:t>Validation:</w:t>
+        <w:t>Message WhatsApp non envoyé</w:t>
+      </w:r>
+    </w:p>
+    <w:p>
+      <w:r>
+        <w:t>Vérifier :</w:t>
+      </w:r>
+    </w:p>
+    <w:p>
+      <w:r>
+        <w:t>1. que Wati est bien connecté</w:t>
+      </w:r>
+    </w:p>
+    <w:p>
+      <w:r>
+        <w:t>2. que le template existe et est approuvé</w:t>
+      </w:r>
+    </w:p>
+    <w:p>
+      <w:r>
+        <w:t>3. que le contact a bien donné son consentement</w:t>
+      </w:r>
+    </w:p>
+    <w:p>
+      <w:r>
+        <w:t>4. que le bon lien live a bien été enregistré pour le bon jour</w:t>
+      </w:r>
+    </w:p>
+    <w:p>
+      <w:pPr>
+        <w:pStyle w:val="Heading3"/>
+      </w:pPr>
+      <w:r>
+        <w:t>Mauvais lien dans un message live</w:t>
+      </w:r>
+    </w:p>
+    <w:p>
+      <w:r>
+        <w:t>1. Ouvrir `PILOTAGE LIVE`</w:t>
+      </w:r>
+    </w:p>
+    <w:p>
+      <w:r>
+        <w:t>2. vérifier la cohorte</w:t>
+      </w:r>
+    </w:p>
+    <w:p>
+      <w:r>
+        <w:t>3. vérifier l'`edition_key`</w:t>
+      </w:r>
+    </w:p>
+    <w:p>
+      <w:r>
+        <w:t>4. réenregistrer le lien StreamYard du jour</w:t>
+      </w:r>
+    </w:p>
+    <w:p>
+      <w:pPr>
+        <w:pStyle w:val="Heading3"/>
+      </w:pPr>
+      <w:r>
+        <w:t>Mauvais lien closer / paiement / replay</w:t>
+      </w:r>
+    </w:p>
+    <w:p>
+      <w:r>
+        <w:t>1. Ouvrir `PILOTAGE LIVE`</w:t>
+      </w:r>
+    </w:p>
+    <w:p>
+      <w:r>
+        <w:t>2. vérifier la bonne `edition_key`</w:t>
+      </w:r>
+    </w:p>
+    <w:p>
+      <w:r>
+        <w:t>3. corriger le ou les liens dans la section dédiée</w:t>
+      </w:r>
+    </w:p>
+    <w:p>
+      <w:r>
+        <w:t>4. recliquer sur **Enregistrer les liens**</w:t>
+      </w:r>
+    </w:p>
+    <w:p>
+      <w:pPr>
+        <w:pStyle w:val="Heading3"/>
+      </w:pPr>
+      <w:r>
+        <w:t>Mauvaise branche présent / absent / non inscrit</w:t>
+      </w:r>
+    </w:p>
+    <w:p>
+      <w:r>
+        <w:t>Vérifier :</w:t>
+      </w:r>
+    </w:p>
+    <w:p>
+      <w:r>
+        <w:t>1. que les inscrits ont bien été envoyés</w:t>
+      </w:r>
+    </w:p>
+    <w:p>
+      <w:r>
+        <w:t>2. que les présents ont bien été envoyés après le live</w:t>
+      </w:r>
+    </w:p>
+    <w:p>
+      <w:r>
+        <w:t>---</w:t>
+      </w:r>
+    </w:p>
+    <w:p>
+      <w:pPr>
+        <w:pStyle w:val="Heading2"/>
+      </w:pPr>
+      <w:r>
+        <w:t>11. Ce qui a été réalisé techniquement</w:t>
+      </w:r>
+    </w:p>
+    <w:p>
+      <w:r>
+        <w:t>Le projet livré inclut :</w:t>
       </w:r>
     </w:p>
     <w:p>
@@ -960,7 +1802,121 @@
         <w:ind w:left="288" w:hanging="216"/>
       </w:pPr>
       <w:r>
-        <w:t>• The operator can paste the URL into the PILOTAGE LIVE portal.</w:t>
+        <w:t>• intégration Systeme.io</w:t>
+      </w:r>
+    </w:p>
+    <w:p>
+      <w:pPr>
+        <w:ind w:left="288" w:hanging="216"/>
+      </w:pPr>
+      <w:r>
+        <w:t>• intégration n8n</w:t>
+      </w:r>
+    </w:p>
+    <w:p>
+      <w:pPr>
+        <w:ind w:left="288" w:hanging="216"/>
+      </w:pPr>
+      <w:r>
+        <w:t>• intégration Wati</w:t>
+      </w:r>
+    </w:p>
+    <w:p>
+      <w:pPr>
+        <w:ind w:left="288" w:hanging="216"/>
+      </w:pPr>
+      <w:r>
+        <w:t>• gestion du consentement</w:t>
+      </w:r>
+    </w:p>
+    <w:p>
+      <w:pPr>
+        <w:ind w:left="288" w:hanging="216"/>
+      </w:pPr>
+      <w:r>
+        <w:t>• scoring et segmentation</w:t>
+      </w:r>
+    </w:p>
+    <w:p>
+      <w:pPr>
+        <w:ind w:left="288" w:hanging="216"/>
+      </w:pPr>
+      <w:r>
+        <w:t>• logique de branches comportementales</w:t>
+      </w:r>
+    </w:p>
+    <w:p>
+      <w:pPr>
+        <w:ind w:left="288" w:hanging="216"/>
+      </w:pPr>
+      <w:r>
+        <w:t>• arrêt automatique des envois après achat</w:t>
+      </w:r>
+    </w:p>
+    <w:p>
+      <w:pPr>
+        <w:ind w:left="288" w:hanging="216"/>
+      </w:pPr>
+      <w:r>
+        <w:t>• portail opérateur StreamYard</w:t>
+      </w:r>
+    </w:p>
+    <w:p>
+      <w:pPr>
+        <w:ind w:left="288" w:hanging="216"/>
+      </w:pPr>
+      <w:r>
+        <w:t>• console admin</w:t>
+      </w:r>
+    </w:p>
+    <w:p>
+      <w:pPr>
+        <w:ind w:left="288" w:hanging="216"/>
+      </w:pPr>
+      <w:r>
+        <w:t>• documentation de remise</w:t>
+      </w:r>
+    </w:p>
+    <w:p>
+      <w:r>
+        <w:t>En résumé :</w:t>
+      </w:r>
+    </w:p>
+    <w:p>
+      <w:pPr>
+        <w:ind w:left="288" w:hanging="216"/>
+      </w:pPr>
+      <w:r>
+        <w:t>• le socle technique est construit</w:t>
+      </w:r>
+    </w:p>
+    <w:p>
+      <w:pPr>
+        <w:ind w:left="288" w:hanging="216"/>
+      </w:pPr>
+      <w:r>
+        <w:t>• l'exploitation est cadrée</w:t>
+      </w:r>
+    </w:p>
+    <w:p>
+      <w:pPr>
+        <w:ind w:left="288" w:hanging="216"/>
+      </w:pPr>
+      <w:r>
+        <w:t>• le client peut travailler sans passer par des commandes serveur</w:t>
+      </w:r>
+    </w:p>
+    <w:p>
+      <w:r>
+        <w:t>---</w:t>
+      </w:r>
+    </w:p>
+    <w:p>
+      <w:pPr>
+        <w:pStyle w:val="Heading2"/>
+      </w:pPr>
+      <w:r>
+        <w:t>12. Avantages concrets pour le client</w:t>
       </w:r>
     </w:p>
     <w:p>
@@ -968,42 +1924,7 @@
         <w:pStyle w:val="Heading3"/>
       </w:pPr>
       <w:r>
-        <w:t>Step 4 - Use PILOTAGE LIVE (Before / During / After)</w:t>
-      </w:r>
-    </w:p>
-    <w:p>
-      <w:r>
-        <w:t>#### 4.A Before the live (mandatory)</w:t>
-      </w:r>
-    </w:p>
-    <w:p>
-      <w:r>
-        <w:t>1. Open PILOTAGE LIVE portal.</w:t>
-      </w:r>
-    </w:p>
-    <w:p>
-      <w:r>
-        <w:t>2. Select cohort.</w:t>
-      </w:r>
-    </w:p>
-    <w:p>
-      <w:r>
-        <w:t>3. Fill `edition_key` and `day_number`.</w:t>
-      </w:r>
-    </w:p>
-    <w:p>
-      <w:r>
-        <w:t>4. Paste the StreamYard live URL.</w:t>
-      </w:r>
-    </w:p>
-    <w:p>
-      <w:r>
-        <w:t>5. Click "Enregistrer le live".</w:t>
-      </w:r>
-    </w:p>
-    <w:p>
-      <w:r>
-        <w:t>Outcome:</w:t>
+        <w:t>12.1 Gain opérationnel</w:t>
       </w:r>
     </w:p>
     <w:p>
@@ -1011,27 +1932,7 @@
         <w:ind w:left="288" w:hanging="216"/>
       </w:pPr>
       <w:r>
-        <w:t>• All reminders for that day use the correct live link.</w:t>
-      </w:r>
-    </w:p>
-    <w:p>
-      <w:r>
-        <w:t>#### 4.A bis Configure edition links (mandatory before offer/replay messages)</w:t>
-      </w:r>
-    </w:p>
-    <w:p>
-      <w:r>
-        <w:t>1. Stay on the same `PILOTAGE LIVE` portal.</w:t>
-      </w:r>
-    </w:p>
-    <w:p>
-      <w:r>
-        <w:t>2. Keep the correct cohort + `edition_key`.</w:t>
-      </w:r>
-    </w:p>
-    <w:p>
-      <w:r>
-        <w:t>3. Fill:</w:t>
+        <w:t>• plus besoin de manipulations techniques pour les lives</w:t>
       </w:r>
     </w:p>
     <w:p>
@@ -1039,7 +1940,7 @@
         <w:ind w:left="288" w:hanging="216"/>
       </w:pPr>
       <w:r>
-        <w:t>• payment link</w:t>
+        <w:t>• moins d'erreurs humaines</w:t>
       </w:r>
     </w:p>
     <w:p>
@@ -1047,7 +1948,15 @@
         <w:ind w:left="288" w:hanging="216"/>
       </w:pPr>
       <w:r>
-        <w:t>• closer / booking link</w:t>
+        <w:t>• processus clair et reproductible</w:t>
+      </w:r>
+    </w:p>
+    <w:p>
+      <w:pPr>
+        <w:pStyle w:val="Heading3"/>
+      </w:pPr>
+      <w:r>
+        <w:t>12.2 Gain commercial</w:t>
       </w:r>
     </w:p>
     <w:p>
@@ -1055,7 +1964,7 @@
         <w:ind w:left="288" w:hanging="216"/>
       </w:pPr>
       <w:r>
-        <w:t>• replay day 1</w:t>
+        <w:t>• meilleur suivi des leads</w:t>
       </w:r>
     </w:p>
     <w:p>
@@ -1063,7 +1972,7 @@
         <w:ind w:left="288" w:hanging="216"/>
       </w:pPr>
       <w:r>
-        <w:t>• replay day 2</w:t>
+        <w:t>• relances plus pertinentes</w:t>
       </w:r>
     </w:p>
     <w:p>
@@ -1071,17 +1980,7 @@
         <w:ind w:left="288" w:hanging="216"/>
       </w:pPr>
       <w:r>
-        <w:t>• replay day 3</w:t>
-      </w:r>
-    </w:p>
-    <w:p>
-      <w:r>
-        <w:t>4. Click "Enregistrer les liens".</w:t>
-      </w:r>
-    </w:p>
-    <w:p>
-      <w:r>
-        <w:t>Outcome:</w:t>
+        <w:t>• meilleure attendance live</w:t>
       </w:r>
     </w:p>
     <w:p>
@@ -1089,7 +1988,15 @@
         <w:ind w:left="288" w:hanging="216"/>
       </w:pPr>
       <w:r>
-        <w:t>• Day 3 offer messages use the correct payment page.</w:t>
+        <w:t>• meilleure qualité de reprise post-live</w:t>
+      </w:r>
+    </w:p>
+    <w:p>
+      <w:pPr>
+        <w:pStyle w:val="Heading3"/>
+      </w:pPr>
+      <w:r>
+        <w:t>12.3 Gain de lisibilité</w:t>
       </w:r>
     </w:p>
     <w:p>
@@ -1097,7 +2004,7 @@
         <w:ind w:left="288" w:hanging="216"/>
       </w:pPr>
       <w:r>
-        <w:t>• Post-live recap messages use the correct replay links.</w:t>
+        <w:t>• visibilité centralisée dans la console</w:t>
       </w:r>
     </w:p>
     <w:p>
@@ -1105,32 +2012,7 @@
         <w:ind w:left="288" w:hanging="216"/>
       </w:pPr>
       <w:r>
-        <w:t>• Booking / closer messages use the correct reservation link.</w:t>
-      </w:r>
-    </w:p>
-    <w:p>
-      <w:r>
-        <w:t>#### 4.B Just before / at the start (recommended)</w:t>
-      </w:r>
-    </w:p>
-    <w:p>
-      <w:r>
-        <w:t>1. Export or gather StreamYard registrants.</w:t>
-      </w:r>
-    </w:p>
-    <w:p>
-      <w:r>
-        <w:t>2. Paste numbers (one per line) or import CSV.</w:t>
-      </w:r>
-    </w:p>
-    <w:p>
-      <w:r>
-        <w:t>3. Click "Envoyer les inscrits".</w:t>
-      </w:r>
-    </w:p>
-    <w:p>
-      <w:r>
-        <w:t>Outcome:</w:t>
+        <w:t>• inbox Wati pour les réponses</w:t>
       </w:r>
     </w:p>
     <w:p>
@@ -1138,32 +2020,30 @@
         <w:ind w:left="288" w:hanging="216"/>
       </w:pPr>
       <w:r>
-        <w:t>• The system can branch follow-ups (registered-absent vs not-registered).</w:t>
-      </w:r>
-    </w:p>
-    <w:p>
-      <w:r>
-        <w:t>#### 4.C After the live (mandatory)</w:t>
-      </w:r>
-    </w:p>
-    <w:p>
-      <w:r>
-        <w:t>1. Export or gather attendees.</w:t>
-      </w:r>
-    </w:p>
-    <w:p>
-      <w:r>
-        <w:t>2. Paste numbers or import CSV.</w:t>
-      </w:r>
-    </w:p>
-    <w:p>
-      <w:r>
-        <w:t>3. Click "Envoyer les presents".</w:t>
-      </w:r>
-    </w:p>
-    <w:p>
-      <w:r>
-        <w:t>Outcome:</w:t>
+        <w:t>• logique de cohortes plus propre</w:t>
+      </w:r>
+    </w:p>
+    <w:p>
+      <w:r>
+        <w:t>---</w:t>
+      </w:r>
+    </w:p>
+    <w:p>
+      <w:pPr>
+        <w:pStyle w:val="Heading2"/>
+      </w:pPr>
+      <w:r>
+        <w:t>13. Limites connues et règle d'exploitation</w:t>
+      </w:r>
+    </w:p>
+    <w:p>
+      <w:r>
+        <w:t>Le système est automatisé, mais la partie StreamYard reste volontairement opérateur.</w:t>
+      </w:r>
+    </w:p>
+    <w:p>
+      <w:r>
+        <w:t>Concrètement :</w:t>
       </w:r>
     </w:p>
     <w:p>
@@ -1171,7 +2051,43 @@
         <w:ind w:left="288" w:hanging="216"/>
       </w:pPr>
       <w:r>
-        <w:t>• The system branches Day 2/Day 3/post-live messages correctly.</w:t>
+        <w:t>• le client doit encore renseigner les éléments live dans `PILOTAGE LIVE`</w:t>
+      </w:r>
+    </w:p>
+    <w:p>
+      <w:pPr>
+        <w:ind w:left="288" w:hanging="216"/>
+      </w:pPr>
+      <w:r>
+        <w:t>• cette procédure existe parce que StreamYard ne fournit pas ici une intégration exploitable aussi simplement que Systeme.io</w:t>
+      </w:r>
+    </w:p>
+    <w:p>
+      <w:r>
+        <w:t>Cela reste une procédure légère, mais elle doit être faite sérieusement à chaque édition.</w:t>
+      </w:r>
+    </w:p>
+    <w:p>
+      <w:r>
+        <w:t>---</w:t>
+      </w:r>
+    </w:p>
+    <w:p>
+      <w:pPr>
+        <w:pStyle w:val="Heading2"/>
+      </w:pPr>
+      <w:r>
+        <w:t>14. Possibilités de scaling du système</w:t>
+      </w:r>
+    </w:p>
+    <w:p>
+      <w:r>
+        <w:t>Le système actuel peut déjà produire des résultats.</w:t>
+      </w:r>
+    </w:p>
+    <w:p>
+      <w:r>
+        <w:t>Mais il peut aussi être développé dans une logique de retainer pour augmenter la performance commerciale, réduire l'effort humain et professionnaliser encore davantage l'exploitation.</w:t>
       </w:r>
     </w:p>
     <w:p>
@@ -1179,22 +2095,12 @@
         <w:pStyle w:val="Heading3"/>
       </w:pPr>
       <w:r>
-        <w:t>Step 5 - Daily monitoring</w:t>
-      </w:r>
-    </w:p>
-    <w:p>
-      <w:r>
-        <w:t>1. Check Wati inbox for replies.</w:t>
-      </w:r>
-    </w:p>
-    <w:p>
-      <w:r>
-        <w:t>2. Respond manually when needed (or assign to closers).</w:t>
-      </w:r>
-    </w:p>
-    <w:p>
-      <w:r>
-        <w:t>3. Check Admin Console for:</w:t>
+        <w:t>Option A - Optimisation conversion continue</w:t>
+      </w:r>
+    </w:p>
+    <w:p>
+      <w:r>
+        <w:t>Ce qui peut être ajouté :</w:t>
       </w:r>
     </w:p>
     <w:p>
@@ -1202,7 +2108,7 @@
         <w:ind w:left="288" w:hanging="216"/>
       </w:pPr>
       <w:r>
-        <w:t>• contact count</w:t>
+        <w:t>• amélioration mensuelle des séquences</w:t>
       </w:r>
     </w:p>
     <w:p>
@@ -1210,7 +2116,7 @@
         <w:ind w:left="288" w:hanging="216"/>
       </w:pPr>
       <w:r>
-        <w:t>• message count</w:t>
+        <w:t>• optimisation des timings de relance</w:t>
       </w:r>
     </w:p>
     <w:p>
@@ -1218,7 +2124,234 @@
         <w:ind w:left="288" w:hanging="216"/>
       </w:pPr>
       <w:r>
-        <w:t>• human follow-up queue</w:t>
+        <w:t>• A/B tests sur messages et transitions</w:t>
+      </w:r>
+    </w:p>
+    <w:p>
+      <w:pPr>
+        <w:ind w:left="288" w:hanging="216"/>
+      </w:pPr>
+      <w:r>
+        <w:t>• amélioration des branches comportementales</w:t>
+      </w:r>
+    </w:p>
+    <w:p>
+      <w:r>
+        <w:t>Bénéfice :</w:t>
+      </w:r>
+    </w:p>
+    <w:p>
+      <w:pPr>
+        <w:ind w:left="288" w:hanging="216"/>
+      </w:pPr>
+      <w:r>
+        <w:t>• plus de présence live</w:t>
+      </w:r>
+    </w:p>
+    <w:p>
+      <w:pPr>
+        <w:ind w:left="288" w:hanging="216"/>
+      </w:pPr>
+      <w:r>
+        <w:t>• meilleure conversion sans augmenter le budget pub</w:t>
+      </w:r>
+    </w:p>
+    <w:p>
+      <w:pPr>
+        <w:pStyle w:val="Heading3"/>
+      </w:pPr>
+      <w:r>
+        <w:t>Option B - Réduction de l'effort opérateur</w:t>
+      </w:r>
+    </w:p>
+    <w:p>
+      <w:r>
+        <w:t>Ce qui peut être ajouté :</w:t>
+      </w:r>
+    </w:p>
+    <w:p>
+      <w:pPr>
+        <w:ind w:left="288" w:hanging="216"/>
+      </w:pPr>
+      <w:r>
+        <w:t>• rappels intelligents si l'équipe oublie une étape StreamYard</w:t>
+      </w:r>
+    </w:p>
+    <w:p>
+      <w:pPr>
+        <w:ind w:left="288" w:hanging="216"/>
+      </w:pPr>
+      <w:r>
+        <w:t>• contrôle qualité automatique</w:t>
+      </w:r>
+    </w:p>
+    <w:p>
+      <w:pPr>
+        <w:ind w:left="288" w:hanging="216"/>
+      </w:pPr>
+      <w:r>
+        <w:t>• semi-automatisation plus poussée autour des exports</w:t>
+      </w:r>
+    </w:p>
+    <w:p>
+      <w:r>
+        <w:t>Bénéfice :</w:t>
+      </w:r>
+    </w:p>
+    <w:p>
+      <w:pPr>
+        <w:ind w:left="288" w:hanging="216"/>
+      </w:pPr>
+      <w:r>
+        <w:t>• moins de risque d'erreur</w:t>
+      </w:r>
+    </w:p>
+    <w:p>
+      <w:pPr>
+        <w:ind w:left="288" w:hanging="216"/>
+      </w:pPr>
+      <w:r>
+        <w:t>• moins de dépendance à une personne précise</w:t>
+      </w:r>
+    </w:p>
+    <w:p>
+      <w:pPr>
+        <w:pStyle w:val="Heading3"/>
+      </w:pPr>
+      <w:r>
+        <w:t>Option C - Amélioration du suivi commercial</w:t>
+      </w:r>
+    </w:p>
+    <w:p>
+      <w:r>
+        <w:t>Ce qui peut être ajouté :</w:t>
+      </w:r>
+    </w:p>
+    <w:p>
+      <w:pPr>
+        <w:ind w:left="288" w:hanging="216"/>
+      </w:pPr>
+      <w:r>
+        <w:t>• meilleure vue closer</w:t>
+      </w:r>
+    </w:p>
+    <w:p>
+      <w:pPr>
+        <w:ind w:left="288" w:hanging="216"/>
+      </w:pPr>
+      <w:r>
+        <w:t>• priorisation automatique des leads chauds</w:t>
+      </w:r>
+    </w:p>
+    <w:p>
+      <w:pPr>
+        <w:ind w:left="288" w:hanging="216"/>
+      </w:pPr>
+      <w:r>
+        <w:t>• suivi avancé des objections</w:t>
+      </w:r>
+    </w:p>
+    <w:p>
+      <w:pPr>
+        <w:ind w:left="288" w:hanging="216"/>
+      </w:pPr>
+      <w:r>
+        <w:t>• enrichissement de la relance humaine</w:t>
+      </w:r>
+    </w:p>
+    <w:p>
+      <w:r>
+        <w:t>Bénéfice :</w:t>
+      </w:r>
+    </w:p>
+    <w:p>
+      <w:pPr>
+        <w:ind w:left="288" w:hanging="216"/>
+      </w:pPr>
+      <w:r>
+        <w:t>• meilleure efficacité commerciale</w:t>
+      </w:r>
+    </w:p>
+    <w:p>
+      <w:pPr>
+        <w:ind w:left="288" w:hanging="216"/>
+      </w:pPr>
+      <w:r>
+        <w:t>• meilleur taux de closing</w:t>
+      </w:r>
+    </w:p>
+    <w:p>
+      <w:pPr>
+        <w:pStyle w:val="Heading3"/>
+      </w:pPr>
+      <w:r>
+        <w:t>Option D - Intelligence conversationnelle plus avancée</w:t>
+      </w:r>
+    </w:p>
+    <w:p>
+      <w:r>
+        <w:t>Ce qui peut être ajouté :</w:t>
+      </w:r>
+    </w:p>
+    <w:p>
+      <w:pPr>
+        <w:ind w:left="288" w:hanging="216"/>
+      </w:pPr>
+      <w:r>
+        <w:t>• mémoire plus riche par lead</w:t>
+      </w:r>
+    </w:p>
+    <w:p>
+      <w:pPr>
+        <w:ind w:left="288" w:hanging="216"/>
+      </w:pPr>
+      <w:r>
+        <w:t>• handoff plus propre entre IA et humain</w:t>
+      </w:r>
+    </w:p>
+    <w:p>
+      <w:pPr>
+        <w:ind w:left="288" w:hanging="216"/>
+      </w:pPr>
+      <w:r>
+        <w:t>• détection d'intention plus fine</w:t>
+      </w:r>
+    </w:p>
+    <w:p>
+      <w:pPr>
+        <w:ind w:left="288" w:hanging="216"/>
+      </w:pPr>
+      <w:r>
+        <w:t>• scénarios de reprise personnalisés</w:t>
+      </w:r>
+    </w:p>
+    <w:p>
+      <w:r>
+        <w:t>Bénéfice :</w:t>
+      </w:r>
+    </w:p>
+    <w:p>
+      <w:pPr>
+        <w:ind w:left="288" w:hanging="216"/>
+      </w:pPr>
+      <w:r>
+        <w:t>• meilleure expérience prospect</w:t>
+      </w:r>
+    </w:p>
+    <w:p>
+      <w:pPr>
+        <w:ind w:left="288" w:hanging="216"/>
+      </w:pPr>
+      <w:r>
+        <w:t>• plus de confiance</w:t>
+      </w:r>
+    </w:p>
+    <w:p>
+      <w:pPr>
+        <w:ind w:left="288" w:hanging="216"/>
+      </w:pPr>
+      <w:r>
+        <w:t>• plus de cohérence sur toute la durée du challenge</w:t>
       </w:r>
     </w:p>
     <w:p>
@@ -1231,104 +2364,97 @@
         <w:pStyle w:val="Heading2"/>
       </w:pPr>
       <w:r>
-        <w:t>7. What To Do If Something Looks Wrong</w:t>
-      </w:r>
-    </w:p>
-    <w:p>
-      <w:pPr>
-        <w:pStyle w:val="Heading3"/>
-      </w:pPr>
-      <w:r>
-        <w:t>WhatsApp message not sent</w:t>
-      </w:r>
-    </w:p>
-    <w:p>
-      <w:r>
-        <w:t>Checklist:</w:t>
-      </w:r>
-    </w:p>
-    <w:p>
-      <w:r>
-        <w:t>1. Is the number connected in Wati?</w:t>
-      </w:r>
-    </w:p>
-    <w:p>
-      <w:r>
-        <w:t>2. Is the template approved in Wati (same name as the system expects)?</w:t>
-      </w:r>
-    </w:p>
-    <w:p>
-      <w:r>
-        <w:t>3. Is the contact opted-in (consent)?</w:t>
-      </w:r>
-    </w:p>
-    <w:p>
-      <w:r>
-        <w:t>4. Was the live URL registered in PILOTAGE LIVE for that day/cohort?</w:t>
-      </w:r>
-    </w:p>
-    <w:p>
-      <w:pPr>
-        <w:pStyle w:val="Heading3"/>
-      </w:pPr>
-      <w:r>
-        <w:t>Wrong link in reminders</w:t>
-      </w:r>
-    </w:p>
-    <w:p>
-      <w:r>
-        <w:t>1. Open PILOTAGE LIVE.</w:t>
-      </w:r>
-    </w:p>
-    <w:p>
-      <w:r>
-        <w:t>2. Re-submit the live URL for the correct cohort/day.</w:t>
-      </w:r>
-    </w:p>
-    <w:p>
-      <w:pPr>
-        <w:pStyle w:val="Heading3"/>
-      </w:pPr>
-      <w:r>
-        <w:t>Wrong payment / closer / replay link</w:t>
-      </w:r>
-    </w:p>
-    <w:p>
-      <w:r>
-        <w:t>1. Open PILOTAGE LIVE.</w:t>
-      </w:r>
-    </w:p>
-    <w:p>
-      <w:r>
-        <w:t>2. Keep the correct `edition_key`.</w:t>
-      </w:r>
-    </w:p>
-    <w:p>
-      <w:r>
-        <w:t>3. Update the affected link in the "Liens de vente et replay" section.</w:t>
-      </w:r>
-    </w:p>
-    <w:p>
-      <w:r>
-        <w:t>4. Click "Enregistrer les liens" again.</w:t>
-      </w:r>
-    </w:p>
-    <w:p>
-      <w:pPr>
-        <w:pStyle w:val="Heading3"/>
-      </w:pPr>
-      <w:r>
-        <w:t>Branching seems incorrect (present vs absent)</w:t>
-      </w:r>
-    </w:p>
-    <w:p>
-      <w:r>
-        <w:t>1. Confirm registrants were sent.</w:t>
-      </w:r>
-    </w:p>
-    <w:p>
-      <w:r>
-        <w:t>2. Confirm attendees were sent after the live.</w:t>
+        <w:t>15. Conclusion</w:t>
+      </w:r>
+    </w:p>
+    <w:p>
+      <w:r>
+        <w:t>Le système livré permet :</w:t>
+      </w:r>
+    </w:p>
+    <w:p>
+      <w:pPr>
+        <w:ind w:left="288" w:hanging="216"/>
+      </w:pPr>
+      <w:r>
+        <w:t>• de capter les leads</w:t>
+      </w:r>
+    </w:p>
+    <w:p>
+      <w:pPr>
+        <w:ind w:left="288" w:hanging="216"/>
+      </w:pPr>
+      <w:r>
+        <w:t>• de les faire entrer dans la bonne cohorte</w:t>
+      </w:r>
+    </w:p>
+    <w:p>
+      <w:pPr>
+        <w:ind w:left="288" w:hanging="216"/>
+      </w:pPr>
+      <w:r>
+        <w:t>• de les relancer automatiquement sur WhatsApp</w:t>
+      </w:r>
+    </w:p>
+    <w:p>
+      <w:pPr>
+        <w:ind w:left="288" w:hanging="216"/>
+      </w:pPr>
+      <w:r>
+        <w:t>• de piloter correctement les sessions live</w:t>
+      </w:r>
+    </w:p>
+    <w:p>
+      <w:pPr>
+        <w:ind w:left="288" w:hanging="216"/>
+      </w:pPr>
+      <w:r>
+        <w:t>• de distinguer présents, absents et non inscrits</w:t>
+      </w:r>
+    </w:p>
+    <w:p>
+      <w:pPr>
+        <w:ind w:left="288" w:hanging="216"/>
+      </w:pPr>
+      <w:r>
+        <w:t>• de reprendre les leads après le challenge</w:t>
+      </w:r>
+    </w:p>
+    <w:p>
+      <w:r>
+        <w:t>Le client dispose maintenant :</w:t>
+      </w:r>
+    </w:p>
+    <w:p>
+      <w:pPr>
+        <w:ind w:left="288" w:hanging="216"/>
+      </w:pPr>
+      <w:r>
+        <w:t>• d'un système fonctionnel</w:t>
+      </w:r>
+    </w:p>
+    <w:p>
+      <w:pPr>
+        <w:ind w:left="288" w:hanging="216"/>
+      </w:pPr>
+      <w:r>
+        <w:t>• d'un portail opérateur simple</w:t>
+      </w:r>
+    </w:p>
+    <w:p>
+      <w:pPr>
+        <w:ind w:left="288" w:hanging="216"/>
+      </w:pPr>
+      <w:r>
+        <w:t>• d'une procédure claire</w:t>
+      </w:r>
+    </w:p>
+    <w:p>
+      <w:pPr>
+        <w:ind w:left="288" w:hanging="216"/>
+      </w:pPr>
+      <w:r>
+        <w:t>• d'une base solide qui peut évoluer vers un accompagnement mensuel plus stratégique</w:t>
       </w:r>
     </w:p>
     <w:p>
@@ -1341,7 +2467,12 @@
         <w:pStyle w:val="Heading2"/>
       </w:pPr>
       <w:r>
-        <w:t>8. Advantages / Why This System Works</w:t>
+        <w:t>16. Checklist finale d'utilisation</w:t>
+      </w:r>
+    </w:p>
+    <w:p>
+      <w:r>
+        <w:t>Avant une édition :</w:t>
       </w:r>
     </w:p>
     <w:p>
@@ -1349,7 +2480,7 @@
         <w:ind w:left="288" w:hanging="216"/>
       </w:pPr>
       <w:r>
-        <w:t>• Faster lead response times on WhatsApp.</w:t>
+        <w:t>• vérifier Wati</w:t>
       </w:r>
     </w:p>
     <w:p>
@@ -1357,7 +2488,7 @@
         <w:ind w:left="288" w:hanging="216"/>
       </w:pPr>
       <w:r>
-        <w:t>• Higher live attendance via structured reminders.</w:t>
+        <w:t>• vérifier Systeme.io</w:t>
       </w:r>
     </w:p>
     <w:p>
@@ -1365,7 +2496,7 @@
         <w:ind w:left="288" w:hanging="216"/>
       </w:pPr>
       <w:r>
-        <w:t>• Reduced manual workload (ops portal replaces technical steps).</w:t>
+        <w:t>• créer les lives StreamYard</w:t>
       </w:r>
     </w:p>
     <w:p>
@@ -1373,7 +2504,7 @@
         <w:ind w:left="288" w:hanging="216"/>
       </w:pPr>
       <w:r>
-        <w:t>• More relevant messaging via behavioral branching.</w:t>
+        <w:t>• ouvrir `PILOTAGE LIVE`</w:t>
       </w:r>
     </w:p>
     <w:p>
@@ -1381,7 +2512,7 @@
         <w:ind w:left="288" w:hanging="216"/>
       </w:pPr>
       <w:r>
-        <w:t>• Cleaner pipeline for closers (human follow-up only where needed).</w:t>
+        <w:t>• enregistrer les liens live</w:t>
       </w:r>
     </w:p>
     <w:p>
@@ -1389,33 +2520,12 @@
         <w:ind w:left="288" w:hanging="216"/>
       </w:pPr>
       <w:r>
-        <w:t>• Automatic suppression after purchase to avoid over-messaging buyers.</w:t>
-      </w:r>
-    </w:p>
-    <w:p>
-      <w:r>
-        <w:t>---</w:t>
-      </w:r>
-    </w:p>
-    <w:p>
-      <w:pPr>
-        <w:pStyle w:val="Heading2"/>
-      </w:pPr>
-      <w:r>
-        <w:t>9. Scaling Options (Retainer Roadmap)</w:t>
-      </w:r>
-    </w:p>
-    <w:p>
-      <w:r>
-        <w:t>This platform is designed to scale. A retainer allows continuous optimization and conversion improvements.</w:t>
-      </w:r>
-    </w:p>
-    <w:p>
-      <w:pPr>
-        <w:pStyle w:val="Heading3"/>
-      </w:pPr>
-      <w:r>
-        <w:t>Option A - Conversion optimization (monthly)</w:t>
+        <w:t>• enregistrer les liens variables de l'édition</w:t>
+      </w:r>
+    </w:p>
+    <w:p>
+      <w:r>
+        <w:t>Pendant l'édition :</w:t>
       </w:r>
     </w:p>
     <w:p>
@@ -1423,7 +2533,7 @@
         <w:ind w:left="288" w:hanging="216"/>
       </w:pPr>
       <w:r>
-        <w:t>• Template iteration based on performance.</w:t>
+        <w:t>• envoyer les inscrits</w:t>
       </w:r>
     </w:p>
     <w:p>
@@ -1431,7 +2541,7 @@
         <w:ind w:left="288" w:hanging="216"/>
       </w:pPr>
       <w:r>
-        <w:t>• Better timing rules per cohort.</w:t>
+        <w:t>• envoyer les présents</w:t>
       </w:r>
     </w:p>
     <w:p>
@@ -1439,7 +2549,12 @@
         <w:ind w:left="288" w:hanging="216"/>
       </w:pPr>
       <w:r>
-        <w:t>• A/B tests on follow-up sequences.</w:t>
+        <w:t>• surveiller Wati et la console admin</w:t>
+      </w:r>
+    </w:p>
+    <w:p>
+      <w:r>
+        <w:t>Après l'édition :</w:t>
       </w:r>
     </w:p>
     <w:p>
@@ -1447,7 +2562,7 @@
         <w:ind w:left="288" w:hanging="216"/>
       </w:pPr>
       <w:r>
-        <w:t>• Better segmentation rules (cold/warm/hot).</w:t>
+        <w:t>• vérifier les replays</w:t>
       </w:r>
     </w:p>
     <w:p>
@@ -1455,12 +2570,7 @@
         <w:ind w:left="288" w:hanging="216"/>
       </w:pPr>
       <w:r>
-        <w:t>• Replay distribution improvements.</w:t>
-      </w:r>
-    </w:p>
-    <w:p>
-      <w:r>
-        <w:t>Benefit:</w:t>
+        <w:t>• vérifier les relances post-live</w:t>
       </w:r>
     </w:p>
     <w:p>
@@ -1468,195 +2578,7 @@
         <w:ind w:left="288" w:hanging="216"/>
       </w:pPr>
       <w:r>
-        <w:t>• More attendance + higher conversion without increasing ad spend.</w:t>
-      </w:r>
-    </w:p>
-    <w:p>
-      <w:pPr>
-        <w:pStyle w:val="Heading3"/>
-      </w:pPr>
-      <w:r>
-        <w:t>Option B - Reduced manual ops (monthly)</w:t>
-      </w:r>
-    </w:p>
-    <w:p>
-      <w:pPr>
-        <w:ind w:left="288" w:hanging="216"/>
-      </w:pPr>
-      <w:r>
-        <w:t>• Semi-automation of StreamYard exports (CSV import templates, Zapier, or alternative tooling).</w:t>
-      </w:r>
-    </w:p>
-    <w:p>
-      <w:pPr>
-        <w:ind w:left="288" w:hanging="216"/>
-      </w:pPr>
-      <w:r>
-        <w:t>• Operator QA checks and alerting.</w:t>
-      </w:r>
-    </w:p>
-    <w:p>
-      <w:pPr>
-        <w:ind w:left="288" w:hanging="216"/>
-      </w:pPr>
-      <w:r>
-        <w:t>• "Did we forget to submit registrants/attendees?" reminders.</w:t>
-      </w:r>
-    </w:p>
-    <w:p>
-      <w:r>
-        <w:t>Benefit:</w:t>
-      </w:r>
-    </w:p>
-    <w:p>
-      <w:pPr>
-        <w:ind w:left="288" w:hanging="216"/>
-      </w:pPr>
-      <w:r>
-        <w:t>• Less risk of human error and smoother execution per live.</w:t>
-      </w:r>
-    </w:p>
-    <w:p>
-      <w:pPr>
-        <w:pStyle w:val="Heading3"/>
-      </w:pPr>
-      <w:r>
-        <w:t>Option C - Sales enablement (monthly)</w:t>
-      </w:r>
-    </w:p>
-    <w:p>
-      <w:pPr>
-        <w:ind w:left="288" w:hanging="216"/>
-      </w:pPr>
-      <w:r>
-        <w:t>• Closer dashboard improvements.</w:t>
-      </w:r>
-    </w:p>
-    <w:p>
-      <w:pPr>
-        <w:ind w:left="288" w:hanging="216"/>
-      </w:pPr>
-      <w:r>
-        <w:t>• Lead summaries and objection tracking.</w:t>
-      </w:r>
-    </w:p>
-    <w:p>
-      <w:pPr>
-        <w:ind w:left="288" w:hanging="216"/>
-      </w:pPr>
-      <w:r>
-        <w:t>• Priority scoring for fastest callbacks.</w:t>
-      </w:r>
-    </w:p>
-    <w:p>
-      <w:r>
-        <w:t>Benefit:</w:t>
-      </w:r>
-    </w:p>
-    <w:p>
-      <w:pPr>
-        <w:ind w:left="288" w:hanging="216"/>
-      </w:pPr>
-      <w:r>
-        <w:t>• Higher close rate with fewer wasted calls.</w:t>
-      </w:r>
-    </w:p>
-    <w:p>
-      <w:pPr>
-        <w:pStyle w:val="Heading3"/>
-      </w:pPr>
-      <w:r>
-        <w:t>Option D - Higher trust automation (monthly)</w:t>
-      </w:r>
-    </w:p>
-    <w:p>
-      <w:pPr>
-        <w:ind w:left="288" w:hanging="216"/>
-      </w:pPr>
-      <w:r>
-        <w:t>• Persistent memory per lead (structured contact memory).</w:t>
-      </w:r>
-    </w:p>
-    <w:p>
-      <w:pPr>
-        <w:ind w:left="288" w:hanging="216"/>
-      </w:pPr>
-      <w:r>
-        <w:t>• Safer, more consistent tone and fewer repetitions.</w:t>
-      </w:r>
-    </w:p>
-    <w:p>
-      <w:pPr>
-        <w:ind w:left="288" w:hanging="216"/>
-      </w:pPr>
-      <w:r>
-        <w:t>• Better handoff notes to humans.</w:t>
-      </w:r>
-    </w:p>
-    <w:p>
-      <w:r>
-        <w:t>Benefit:</w:t>
-      </w:r>
-    </w:p>
-    <w:p>
-      <w:pPr>
-        <w:ind w:left="288" w:hanging="216"/>
-      </w:pPr>
-      <w:r>
-        <w:t>• Better experience and increased trust, especially across multi-day conversations.</w:t>
-      </w:r>
-    </w:p>
-    <w:p>
-      <w:r>
-        <w:t>---</w:t>
-      </w:r>
-    </w:p>
-    <w:p>
-      <w:pPr>
-        <w:pStyle w:val="Heading2"/>
-      </w:pPr>
-      <w:r>
-        <w:t>10. Next Steps (Go-Live Checklist)</w:t>
-      </w:r>
-    </w:p>
-    <w:p>
-      <w:pPr>
-        <w:ind w:left="288" w:hanging="216"/>
-      </w:pPr>
-      <w:r>
-        <w:t>• Confirm Wati templates are approved and match the expected keys.</w:t>
-      </w:r>
-    </w:p>
-    <w:p>
-      <w:pPr>
-        <w:ind w:left="288" w:hanging="216"/>
-      </w:pPr>
-      <w:r>
-        <w:t>• Confirm payment URL, booking URL, and replay URLs are filled in `PILOTAGE LIVE` for the active edition.</w:t>
-      </w:r>
-    </w:p>
-    <w:p>
-      <w:pPr>
-        <w:ind w:left="288" w:hanging="216"/>
-      </w:pPr>
-      <w:r>
-        <w:t>• Confirm both funnels (EU/US-CA) fire webhooks correctly.</w:t>
-      </w:r>
-    </w:p>
-    <w:p>
-      <w:pPr>
-        <w:ind w:left="288" w:hanging="216"/>
-      </w:pPr>
-      <w:r>
-        <w:t>• Confirm PILOTAGE LIVE is accessible and tested.</w:t>
-      </w:r>
-    </w:p>
-    <w:p>
-      <w:pPr>
-        <w:ind w:left="288" w:hanging="216"/>
-      </w:pPr>
-      <w:r>
-        <w:t>• Run one supervised live execution, then switch to autonomous mode.</w:t>
+        <w:t>• suivre les réponses humaines et les closers</w:t>
       </w:r>
     </w:p>
     <w:sectPr>

</xml_diff>